<commit_message>
virale: update all 6 Reels scripts and Webinar plan with real Virale MCP market intelligence for @tolikus
</commit_message>
<xml_diff>
--- a/baza/исходник миникурса/ПЛАН_СЪЕМОК_РИЛС_И_ВЕБИНАР_ДЕНЬГИ_И_СЦЕНАРИИ.docx
+++ b/baza/исходник миникурса/ПЛАН_СЪЕМОК_РИЛС_И_ВЕБИНАР_ДЕНЬГИ_И_СЦЕНАРИИ.docx
@@ -14,7 +14,7 @@
           <w:color w:val="1F4E5B"/>
           <w:sz w:val="34"/>
         </w:rPr>
-        <w:t>ПРОГРАММА ПОДГОТОВКИ: СЪЕМКА 6 REELS + ВЕБИНАР «ДЕНЬГИ И РОДОВЫЕ СЦЕНАРИИ»</w:t>
+        <w:t>СЪЕМОЧНЫЙ ПЛАН: 6 REELS (VIRALE VALIDATED) + ВЕБИНАР «ДЕНЬГИ И СЦЕНАРИИ»</w:t>
       </w:r>
     </w:p>
     <w:p>
@@ -29,6 +29,8 @@
           <w:color w:val="555555"/>
           <w:sz w:val="21"/>
         </w:rPr>
+        <w:t>Сформировано на основе прямого аудита через MCP ChatPlace Virale (@tolikus, ниша Family Relationships)</w:t>
+        <w:br/>
         <w:t>Спикер: Федоров Анатолий Игоревич (Семейный психолог, гипнолог, проректор МАГиГ)</w:t>
       </w:r>
     </w:p>
@@ -43,7 +45,7 @@
           <w:color w:val="1F4E5B"/>
           <w:sz w:val="26"/>
         </w:rPr>
-        <w:t>РАЗДЕЛ 1: ПАКЕТ 6 ВИРУСНЫХ REELS ДЛЯ ВОРОНКИ ПСИКВЕСТА</w:t>
+        <w:t>РАЗДЕЛ 0: ДАННЫЕ АНАЛИТИКИ VIRALE ДЛЯ АККАУНТА @TOLIKUS</w:t>
       </w:r>
     </w:p>
     <w:p>
@@ -56,7 +58,7 @@
           <w:b/>
           <w:sz w:val="20"/>
         </w:rPr>
-        <w:t xml:space="preserve">Формат съемки: </w:t>
+        <w:t xml:space="preserve">Позиция в нише: </w:t>
       </w:r>
       <w:r>
         <w:rPr>
@@ -64,7 +66,48 @@
           <w:i w:val="0"/>
           <w:sz w:val="20"/>
         </w:rPr>
-        <w:t>Хронометраж: 40–55 секунд каждый. Формат: Динамичный спикер в кадре, жесткий хук в первые 3 секунды, практический инсайт и CTA: «Пиши ТЕСТ в директ/комментарии».</w:t>
+        <w:t>Engagement Rate в топ 9.8% ниши (6.84% при норме 2.73%), но охваты ниже потенциала из-за дефицита эмоциональных микро-хуков и CTA.</w:t>
+      </w:r>
+    </w:p>
+    <w:p>
+      <w:pPr>
+        <w:spacing w:after="80" w:line="276" w:lineRule="auto"/>
+      </w:pPr>
+      <w:r>
+        <w:rPr>
+          <w:rFonts w:ascii="Calibri" w:hAnsi="Calibri"/>
+          <w:b/>
+          <w:sz w:val="20"/>
+        </w:rPr>
+        <w:t xml:space="preserve">Ключевые инсайты алгоритма: </w:t>
+      </w:r>
+      <w:r>
+        <w:rPr>
+          <w:rFonts w:ascii="Calibri" w:hAnsi="Calibri"/>
+          <w:i w:val="0"/>
+          <w:sz w:val="20"/>
+        </w:rPr>
+        <w:t>1. Оптимальный хронометраж: 30–50 секунд (sweet spot ниши).</w:t>
+        <w:br/>
+        <w:t>2. Топовый формат ниши: Storytelling + Personal Confession (65.45% рынка, средний вирусный скор 54.5).</w:t>
+        <w:br/>
+        <w:t>3. Топовый тип хука: Emotional + Visual Text (80.91% ниши).</w:t>
+        <w:br/>
+        <w:t>4. Проблема аккаунта: только 9.09% роликов имели CTA. Нужно 100% внедрение четкого CTA на слово-триггер ТЕСТ.</w:t>
+      </w:r>
+    </w:p>
+    <w:p>
+      <w:pPr>
+        <w:spacing w:before="280" w:after="60"/>
+      </w:pPr>
+      <w:r>
+        <w:rPr>
+          <w:rFonts w:ascii="Calibri" w:hAnsi="Calibri"/>
+          <w:b/>
+          <w:color w:val="1F4E5B"/>
+          <w:sz w:val="26"/>
+        </w:rPr>
+        <w:t>РАЗДЕЛ 1: СЪЕМОЧНЫЕ СЦЕНАРИИ 6 REELS (ПО ПАТТЕРНАМ VIRALE)</w:t>
       </w:r>
     </w:p>
     <w:p>
@@ -78,7 +121,7 @@
           <w:color w:val="0E6E5D"/>
           <w:sz w:val="23"/>
         </w:rPr>
-        <w:t>🎬 REELS 1: «Почему деньги утекают сквозь пальцы, когда в семье холод»</w:t>
+        <w:t>🎬 REELS 1 (Паттерн Virale: emotional_family_hook + storytelling_personal_confession)</w:t>
       </w:r>
     </w:p>
     <w:p>
@@ -93,7 +136,7 @@
           <w:color w:val="C0392B"/>
           <w:sz w:val="20"/>
         </w:rPr>
-        <w:t>ХУК И СУТЬ</w:t>
+        <w:t>МЕТРИКИ VIRALE</w:t>
         <w:br/>
       </w:r>
       <w:r>
@@ -101,11 +144,55 @@
           <w:rFonts w:ascii="Calibri" w:hAnsi="Calibri"/>
           <w:sz w:val="19"/>
         </w:rPr>
-        <w:t>Хук: «Если у вас в семье начались ссоры — ждите просадки в доходах. И это не мистика, а чистая физиология мозга».</w:t>
+        <w:t>Хронометраж: 35 сек. Эмоция: Revelation + Love. Хук: Текстовый оверлей + личное признание.</w:t>
+      </w:r>
+    </w:p>
+    <w:p>
+      <w:pPr>
+        <w:spacing w:after="80" w:line="276" w:lineRule="auto"/>
+      </w:pPr>
+      <w:r>
+        <w:rPr>
+          <w:rFonts w:ascii="Calibri" w:hAnsi="Calibri"/>
+          <w:b/>
+          <w:sz w:val="20"/>
+        </w:rPr>
+        <w:t xml:space="preserve">Текстовый хук: </w:t>
+      </w:r>
+      <w:r>
+        <w:rPr>
+          <w:rFonts w:ascii="Calibri" w:hAnsi="Calibri"/>
+          <w:i w:val="0"/>
+          <w:sz w:val="20"/>
+        </w:rPr>
+        <w:t>Текст на экране (первые 3 сек): «Почему деньги уходят, когда дома холодно?»</w:t>
+      </w:r>
+    </w:p>
+    <w:p>
+      <w:pPr>
+        <w:spacing w:after="80" w:line="276" w:lineRule="auto"/>
+      </w:pPr>
+      <w:r>
+        <w:rPr>
+          <w:rFonts w:ascii="Calibri" w:hAnsi="Calibri"/>
+          <w:b/>
+          <w:sz w:val="20"/>
+        </w:rPr>
+        <w:t xml:space="preserve">Суфлёр для Анатолия: </w:t>
+      </w:r>
+      <w:r>
+        <w:rPr>
+          <w:rFonts w:ascii="Calibri" w:hAnsi="Calibri"/>
+          <w:i/>
+          <w:sz w:val="20"/>
+        </w:rPr>
+        <w:t>«За 15 лет практики я заметил жесткую закономерность: как только в семье начинается затяжная молчанка или скрытые упреки — у мужчины или женщины моментально проседает доход.</w:t>
         <w:br/>
-        <w:t>Инсайт: Энергия денег требует чувства базовой безопасности. Когда дома война — мозг тратит 90% ресурса на оборону.</w:t>
         <w:br/>
-        <w:t>CTA: «Напиши слово ТЕСТ в комментарии — пришлю экспресс-диагностику твоего сценария».</w:t>
+        <w:t>И дело не в эзотерике. Мозг устроен так: чтобы зарабатывать и рисковать в бизнесе, психике нужен безопасный тыл. Когда дома война — 90% энергии уходит на оборону и тревогу. Вы физически не можете видеть финансовые возможности.</w:t>
+        <w:br/>
+        <w:br/>
+        <w:t>Хотите вернуть тыл и финансовый рост? Напишите слово ТЕСТ в комментарии — пришлю экспресс-диагностику вашего семейного сценария».</w:t>
       </w:r>
     </w:p>
     <w:p>
@@ -119,7 +206,7 @@
           <w:color w:val="0E6E5D"/>
           <w:sz w:val="23"/>
         </w:rPr>
-        <w:t>🎬 REELS 2: «Правило 20 минут, которое спасает брак от развода»</w:t>
+        <w:t>🎬 REELS 2 (Паттерн Virale: medium_story_30_60 + trigger_words)</w:t>
       </w:r>
     </w:p>
     <w:p>
@@ -134,7 +221,7 @@
           <w:color w:val="C0392B"/>
           <w:sz w:val="20"/>
         </w:rPr>
-        <w:t>ХУК И СУТЬ</w:t>
+        <w:t>МЕТРИКИ VIRALE</w:t>
         <w:br/>
       </w:r>
       <w:r>
@@ -142,11 +229,58 @@
           <w:rFonts w:ascii="Calibri" w:hAnsi="Calibri"/>
           <w:sz w:val="19"/>
         </w:rPr>
-        <w:t>Хук: «Никогда не продолжайте ссору, если чувствуете, что сердце колотится. Вы гарантированно скажете то, о чем будете жалеть годами».</w:t>
+        <w:t>Хронометраж: 40 сек. Эмоция: Shock + Relief. Хук: Запрет на фатальную ошибку.</w:t>
+      </w:r>
+    </w:p>
+    <w:p>
+      <w:pPr>
+        <w:spacing w:after="80" w:line="276" w:lineRule="auto"/>
+      </w:pPr>
+      <w:r>
+        <w:rPr>
+          <w:rFonts w:ascii="Calibri" w:hAnsi="Calibri"/>
+          <w:b/>
+          <w:sz w:val="20"/>
+        </w:rPr>
+        <w:t xml:space="preserve">Текстовый хук: </w:t>
+      </w:r>
+      <w:r>
+        <w:rPr>
+          <w:rFonts w:ascii="Calibri" w:hAnsi="Calibri"/>
+          <w:i w:val="0"/>
+          <w:sz w:val="20"/>
+        </w:rPr>
+        <w:t>Текст на экране: «Никогда не продолжай ссору, если колотится сердце»</w:t>
+      </w:r>
+    </w:p>
+    <w:p>
+      <w:pPr>
+        <w:spacing w:after="80" w:line="276" w:lineRule="auto"/>
+      </w:pPr>
+      <w:r>
+        <w:rPr>
+          <w:rFonts w:ascii="Calibri" w:hAnsi="Calibri"/>
+          <w:b/>
+          <w:sz w:val="20"/>
+        </w:rPr>
+        <w:t xml:space="preserve">Суфлёр для Анатолия: </w:t>
+      </w:r>
+      <w:r>
+        <w:rPr>
+          <w:rFonts w:ascii="Calibri" w:hAnsi="Calibri"/>
+          <w:i/>
+          <w:sz w:val="20"/>
+        </w:rPr>
+        <w:t>«Никогда не выясняйте отношения, если чувствуете, что пульс подскочил. В этот момент вы биологически не способны слышать партнера.</w:t>
         <w:br/>
-        <w:t>Инсайт: При пульсе &gt;100 ударов логика отключается. Нужно ровно 20 минут разделения комнат, чтобы слить кортизол.</w:t>
         <w:br/>
-        <w:t>CTA: «Забирай разбор своего типа ссор по слову ТЕСТ».</w:t>
+        <w:t>Профессор Джон Готтман доказал: как только сердце бьется быстрее 100 ударов в минуту — кора мозга отключается. Вы можете только нападать или защищаться. Каждое слово в этом состоянии — яд.</w:t>
+        <w:br/>
+        <w:br/>
+        <w:t>Скажите: «Мы закипаем. Пауза 20 минут». Ровно 20 минут разделения комнат спасают брак от развода.</w:t>
+        <w:br/>
+        <w:br/>
+        <w:t>Напишите слово ТЕСТ в комментарии, чтобы узнать, какой скрытый сценарий ссор разрушает вашу пару».</w:t>
       </w:r>
     </w:p>
     <w:p>
@@ -160,7 +294,7 @@
           <w:color w:val="0E6E5D"/>
           <w:sz w:val="23"/>
         </w:rPr>
-        <w:t>🎬 REELS 3: «Почему с надежными скучно, а тянет к сложным?»</w:t>
+        <w:t>🎬 REELS 3 (Паттерн Virale: mystery_revelation_hook + curiosity)</w:t>
       </w:r>
     </w:p>
     <w:p>
@@ -175,7 +309,7 @@
           <w:color w:val="C0392B"/>
           <w:sz w:val="20"/>
         </w:rPr>
-        <w:t>ХУК И СУТЬ</w:t>
+        <w:t>МЕТРИКИ VIRALE</w:t>
         <w:br/>
       </w:r>
       <w:r>
@@ -183,11 +317,55 @@
           <w:rFonts w:ascii="Calibri" w:hAnsi="Calibri"/>
           <w:sz w:val="19"/>
         </w:rPr>
-        <w:t>Хук: «С хорошими партнерами вам пресно, а ради холодных и недоступных вы готовы не спать ночами? Поздравляю, вы путаете тревогу с любовью».</w:t>
+        <w:t>Хронометраж: 35 сек. Эмоция: Revelation. Хук: Парадокс выбора.</w:t>
+      </w:r>
+    </w:p>
+    <w:p>
+      <w:pPr>
+        <w:spacing w:after="80" w:line="276" w:lineRule="auto"/>
+      </w:pPr>
+      <w:r>
+        <w:rPr>
+          <w:rFonts w:ascii="Calibri" w:hAnsi="Calibri"/>
+          <w:b/>
+          <w:sz w:val="20"/>
+        </w:rPr>
+        <w:t xml:space="preserve">Текстовый хук: </w:t>
+      </w:r>
+      <w:r>
+        <w:rPr>
+          <w:rFonts w:ascii="Calibri" w:hAnsi="Calibri"/>
+          <w:i w:val="0"/>
+          <w:sz w:val="20"/>
+        </w:rPr>
+        <w:t>Текст на экране: «Почему с хорошими пресно, а тянет к сложным?»</w:t>
+      </w:r>
+    </w:p>
+    <w:p>
+      <w:pPr>
+        <w:spacing w:after="80" w:line="276" w:lineRule="auto"/>
+      </w:pPr>
+      <w:r>
+        <w:rPr>
+          <w:rFonts w:ascii="Calibri" w:hAnsi="Calibri"/>
+          <w:b/>
+          <w:sz w:val="20"/>
+        </w:rPr>
+        <w:t xml:space="preserve">Суфлёр для Анатолия: </w:t>
+      </w:r>
+      <w:r>
+        <w:rPr>
+          <w:rFonts w:ascii="Calibri" w:hAnsi="Calibri"/>
+          <w:i/>
+          <w:sz w:val="20"/>
+        </w:rPr>
+        <w:t>«Почему рядом с заботливым и надежным человеком вам скучно и «нет искры», а ради холодного и недоступного вы готовы не спать ночами и терпеть качели?</w:t>
         <w:br/>
-        <w:t>Инсайт: Если в детстве любовь заслуживали, мозг считает спокойствие чужим.</w:t>
         <w:br/>
-        <w:t>CTA: «Пройди 2-минутный Псиквест по слову ТЕСТ в комментариях».</w:t>
+        <w:t>Потому что ваш мозг с детства привык путать тревогу со страстью. Если любовь приходилось заслуживать, спокойные отношения кажутся чужими, а эмоциональный ад — настоящей любовью.</w:t>
+        <w:br/>
+        <w:br/>
+        <w:t>Как перенастроить свой радар? Напишите слово ТЕСТ в комментарии — я пришлю вам 2-минутный тест и разбор вашего типа привязанности».</w:t>
       </w:r>
     </w:p>
     <w:p>
@@ -201,7 +379,7 @@
           <w:color w:val="0E6E5D"/>
           <w:sz w:val="23"/>
         </w:rPr>
-        <w:t>🎬 REELS 4: «Почему удобных мужчин и хороших девочек не ценят»</w:t>
+        <w:t>🎬 REELS 4 (Паттерн Virale: culture_reveal_story + boundary_loss)</w:t>
       </w:r>
     </w:p>
     <w:p>
@@ -216,7 +394,7 @@
           <w:color w:val="C0392B"/>
           <w:sz w:val="20"/>
         </w:rPr>
-        <w:t>ХУК И СУТЬ</w:t>
+        <w:t>МЕТРИКИ VIRALE</w:t>
         <w:br/>
       </w:r>
       <w:r>
@@ -224,11 +402,58 @@
           <w:rFonts w:ascii="Calibri" w:hAnsi="Calibri"/>
           <w:sz w:val="19"/>
         </w:rPr>
-        <w:t>Хук: «Чем больше вы сглаживаете углы и угождаете партнеру, тем быстрее об вас начинают вытирать ноги».</w:t>
+        <w:t>Хронометраж: 38 сек. Эмоция: Resentment ➔ Sovereignty. Хук: Разоблачение ловушки угождения.</w:t>
+      </w:r>
+    </w:p>
+    <w:p>
+      <w:pPr>
+        <w:spacing w:after="80" w:line="276" w:lineRule="auto"/>
+      </w:pPr>
+      <w:r>
+        <w:rPr>
+          <w:rFonts w:ascii="Calibri" w:hAnsi="Calibri"/>
+          <w:b/>
+          <w:sz w:val="20"/>
+        </w:rPr>
+        <w:t xml:space="preserve">Текстовый хук: </w:t>
+      </w:r>
+      <w:r>
+        <w:rPr>
+          <w:rFonts w:ascii="Calibri" w:hAnsi="Calibri"/>
+          <w:i w:val="0"/>
+          <w:sz w:val="20"/>
+        </w:rPr>
+        <w:t>Текст на экране: «Почему удобных людей не любят, а используют»</w:t>
+      </w:r>
+    </w:p>
+    <w:p>
+      <w:pPr>
+        <w:spacing w:after="80" w:line="276" w:lineRule="auto"/>
+      </w:pPr>
+      <w:r>
+        <w:rPr>
+          <w:rFonts w:ascii="Calibri" w:hAnsi="Calibri"/>
+          <w:b/>
+          <w:sz w:val="20"/>
+        </w:rPr>
+        <w:t xml:space="preserve">Суфлёр для Анатолия: </w:t>
+      </w:r>
+      <w:r>
+        <w:rPr>
+          <w:rFonts w:ascii="Calibri" w:hAnsi="Calibri"/>
+          <w:i/>
+          <w:sz w:val="20"/>
+        </w:rPr>
+        <w:t xml:space="preserve">«Вам кажется: если вы будете идеальным, будете сглаживать все углы и предугадывать желания партнера — вас будут носить на руках. </w:t>
         <w:br/>
-        <w:t>Инсайт: Человек без личных границ становится невидимкой. Уважение начинается со слова «нет».</w:t>
         <w:br/>
-        <w:t>CTA: «Пиши ТЕСТ, чтобы узнать свой уровень эмоциональной автономии».</w:t>
+        <w:t>Но в реальности всё наоборот: чем больше вы растворяетесь и угождаете, тем быстрее об вас начинают вытирать ноги.</w:t>
+        <w:br/>
+        <w:br/>
+        <w:t>Удобство вызывает не любовь, а скуку и раздражение. Любят тех, у кого есть свои границы и право сказать твердое «нет».</w:t>
+        <w:br/>
+        <w:br/>
+        <w:t>Хотите вернуть уважение к себе? Напишите слово ТЕСТ — пришлю практику восстановления личных границ».</w:t>
       </w:r>
     </w:p>
     <w:p>
@@ -242,7 +467,7 @@
           <w:color w:val="0E6E5D"/>
           <w:sz w:val="23"/>
         </w:rPr>
-        <w:t>🎬 REELS 5: «Первые 14 дней после измены: чего делать категорически нельзя»</w:t>
+        <w:t>🎬 REELS 5 (Паттерн Virale: loss_reflection_arc + emergency_protection)</w:t>
       </w:r>
     </w:p>
     <w:p>
@@ -257,7 +482,7 @@
           <w:color w:val="C0392B"/>
           <w:sz w:val="20"/>
         </w:rPr>
-        <w:t>ХУК И СУТЬ</w:t>
+        <w:t>МЕТРИКИ VIRALE</w:t>
         <w:br/>
       </w:r>
       <w:r>
@@ -265,11 +490,58 @@
           <w:rFonts w:ascii="Calibri" w:hAnsi="Calibri"/>
           <w:sz w:val="19"/>
         </w:rPr>
-        <w:t>Хук: «Если земля ушла из-под ног из-за предательства — главное правило: не делать резких движений».</w:t>
+        <w:t>Хронометраж: 42 сек. Эмоция: Sadness ➔ Dignity. Хук: Остановка роковой ошибки в шторм.</w:t>
+      </w:r>
+    </w:p>
+    <w:p>
+      <w:pPr>
+        <w:spacing w:after="80" w:line="276" w:lineRule="auto"/>
+      </w:pPr>
+      <w:r>
+        <w:rPr>
+          <w:rFonts w:ascii="Calibri" w:hAnsi="Calibri"/>
+          <w:b/>
+          <w:sz w:val="20"/>
+        </w:rPr>
+        <w:t xml:space="preserve">Текстовый хук: </w:t>
+      </w:r>
+      <w:r>
+        <w:rPr>
+          <w:rFonts w:ascii="Calibri" w:hAnsi="Calibri"/>
+          <w:i w:val="0"/>
+          <w:sz w:val="20"/>
+        </w:rPr>
+        <w:t>Текст на экране: «Первые 14 дней кризиса: что разрушит всё»</w:t>
+      </w:r>
+    </w:p>
+    <w:p>
+      <w:pPr>
+        <w:spacing w:after="80" w:line="276" w:lineRule="auto"/>
+      </w:pPr>
+      <w:r>
+        <w:rPr>
+          <w:rFonts w:ascii="Calibri" w:hAnsi="Calibri"/>
+          <w:b/>
+          <w:sz w:val="20"/>
+        </w:rPr>
+        <w:t xml:space="preserve">Суфлёр для Анатолия: </w:t>
+      </w:r>
+      <w:r>
+        <w:rPr>
+          <w:rFonts w:ascii="Calibri" w:hAnsi="Calibri"/>
+          <w:i/>
+          <w:sz w:val="20"/>
+        </w:rPr>
+        <w:t>«Если в семье произошла измена или прозвучало слово «развод» — худшее, что можно сделать, это устроить ночные допросы или тотальную слежку в телефоне.</w:t>
         <w:br/>
-        <w:t>Инсайт: Ночные допросы и слежка за телефоном не дают облегчения, а убивают самооценку.</w:t>
         <w:br/>
-        <w:t>CTA: «Инструкция выхода из шторма — по слову ТЕСТ».</w:t>
+        <w:t>Каждая новая деталь не приносит облегчения. Она превращается в навязчивые картины, которые сжигают остатки вашей нервной системы и убивают достоинство.</w:t>
+        <w:br/>
+        <w:br/>
+        <w:t>В первые 14 дней вводится железный мораторий на разборки. Сначала заземлите тело и верните сон.</w:t>
+        <w:br/>
+        <w:br/>
+        <w:t>Напишите слово ТЕСТ в комментарии — пришлю пошаговую инструкцию, как пережить острый кризис и не сломаться».</w:t>
       </w:r>
     </w:p>
     <w:p>
@@ -283,7 +555,7 @@
           <w:color w:val="0E6E5D"/>
           <w:sz w:val="23"/>
         </w:rPr>
-        <w:t>🎬 REELS 6: «Денежный потолок: как сценарий родителей блокирует ваш доход»</w:t>
+        <w:t>🎬 REELS 6 (Паттерн Virale: forbidden_knowledge_hook + webinar_bridge)</w:t>
       </w:r>
     </w:p>
     <w:p>
@@ -298,7 +570,7 @@
           <w:color w:val="C0392B"/>
           <w:sz w:val="20"/>
         </w:rPr>
-        <w:t>ХУК И СУТЬ</w:t>
+        <w:t>МЕТРИКИ VIRALE</w:t>
         <w:br/>
       </w:r>
       <w:r>
@@ -306,11 +578,55 @@
           <w:rFonts w:ascii="Calibri" w:hAnsi="Calibri"/>
           <w:sz w:val="19"/>
         </w:rPr>
-        <w:t>Хук: «Вы пашете как вол, но доход упирается в одну и ту же планку? Дело не в бизнес-инструментах, а в лояльности роду».</w:t>
+        <w:t>Хронометраж: 40 сек. Эмоция: Curiosity + Hope. Хук: Скрытый родовая лояльность к бедности.</w:t>
+      </w:r>
+    </w:p>
+    <w:p>
+      <w:pPr>
+        <w:spacing w:after="80" w:line="276" w:lineRule="auto"/>
+      </w:pPr>
+      <w:r>
+        <w:rPr>
+          <w:rFonts w:ascii="Calibri" w:hAnsi="Calibri"/>
+          <w:b/>
+          <w:sz w:val="20"/>
+        </w:rPr>
+        <w:t xml:space="preserve">Текстовый хук: </w:t>
+      </w:r>
+      <w:r>
+        <w:rPr>
+          <w:rFonts w:ascii="Calibri" w:hAnsi="Calibri"/>
+          <w:i w:val="0"/>
+          <w:sz w:val="20"/>
+        </w:rPr>
+        <w:t>Текст на экране: «Денежный потолок: чей сценарий вы проживаете?»</w:t>
+      </w:r>
+    </w:p>
+    <w:p>
+      <w:pPr>
+        <w:spacing w:after="80" w:line="276" w:lineRule="auto"/>
+      </w:pPr>
+      <w:r>
+        <w:rPr>
+          <w:rFonts w:ascii="Calibri" w:hAnsi="Calibri"/>
+          <w:b/>
+          <w:sz w:val="20"/>
+        </w:rPr>
+        <w:t xml:space="preserve">Суфлёр для Анатолия: </w:t>
+      </w:r>
+      <w:r>
+        <w:rPr>
+          <w:rFonts w:ascii="Calibri" w:hAnsi="Calibri"/>
+          <w:i/>
+          <w:sz w:val="20"/>
+        </w:rPr>
+        <w:t>«Вы можете прочитать сотни книг по бизнесу, но если доход упирается в невидимую планку — дело в родовой лояльности.</w:t>
         <w:br/>
-        <w:t>Инсайт: Подсознательный страх зарабатывать больше родителей или страх, что «деньги разрушат семью».</w:t>
         <w:br/>
-        <w:t>CTA: «Разбор родовых денежных сценариев — пиши ДЕНЬГИ или ТЕСТ».</w:t>
+        <w:t>Если в роду было раскулачивание или бедность, подсознание ставит блок: «Большие деньги опасны, из-за них можно потерять семью». И как только доход растет — мозг находит способ слить деньги через непредвиденные траты или семейные ссоры.</w:t>
+        <w:br/>
+        <w:br/>
+        <w:t>Завтра я провожу большой закрытый вебинар «Деньги и Семейные сценарии». Напишите слово ДЕНЬГИ в комментарии — пришлю ссылку на регистрацию».</w:t>
       </w:r>
     </w:p>
     <w:p>
@@ -324,28 +640,7 @@
           <w:color w:val="1F4E5B"/>
           <w:sz w:val="26"/>
         </w:rPr>
-        <w:t>РАЗДЕЛ 2: СТРУКТУРА 60-МИНУТНОГО ВЕБИНАРА «ДЕНЬГИ И СЕМЕЙНЫЕ СЦЕНАРИИ»</w:t>
-      </w:r>
-    </w:p>
-    <w:p>
-      <w:pPr>
-        <w:spacing w:after="80" w:line="276" w:lineRule="auto"/>
-      </w:pPr>
-      <w:r>
-        <w:rPr>
-          <w:rFonts w:ascii="Calibri" w:hAnsi="Calibri"/>
-          <w:b/>
-          <w:sz w:val="20"/>
-        </w:rPr>
-        <w:t xml:space="preserve">Концепция: </w:t>
-      </w:r>
-      <w:r>
-        <w:rPr>
-          <w:rFonts w:ascii="Calibri" w:hAnsi="Calibri"/>
-          <w:i w:val="0"/>
-          <w:sz w:val="20"/>
-        </w:rPr>
-        <w:t>Тема: «Деньги, Род и Семья: как подсознательные программы блокируют доход и разрушают близость». Спикер: Анатолий Фёдоров.</w:t>
+        <w:t>РАЗДЕЛ 2: АРХИТЕКТУРА 60-МИНУТНОГО ВЕБИНАРА «ДЕНЬГИ И РОДОВЫЕ СЦЕНАРИИ»</w:t>
       </w:r>
     </w:p>
     <w:p>

</xml_diff>

<commit_message>
chatplace: synchronize all 6 Reels scripts with exact active bot automations (ДИАЛОГ, ПАУЗА, ВОЗДУХ, СИЛА, ГРАНИЦЫ, ДЕНЬГИ)
</commit_message>
<xml_diff>
--- a/baza/исходник миникурса/ПЛАН_СЪЕМОК_РИЛС_И_ВЕБИНАР_ДЕНЬГИ_И_СЦЕНАРИИ.docx
+++ b/baza/исходник миникурса/ПЛАН_СЪЕМОК_РИЛС_И_ВЕБИНАР_ДЕНЬГИ_И_СЦЕНАРИИ.docx
@@ -14,7 +14,7 @@
           <w:color w:val="1F4E5B"/>
           <w:sz w:val="34"/>
         </w:rPr>
-        <w:t>СЪЕМОЧНЫЙ ПЛАН: 6 REELS (VIRALE VALIDATED) + ВЕБИНАР «ДЕНЬГИ И СЦЕНАРИИ»</w:t>
+        <w:t>СЪЕМОЧНЫЙ ПАКЕТ: 6 REELS ПОД БОЕВЫЕ АВТОМАТИЗАЦИИ CHATPLACE</w:t>
       </w:r>
     </w:p>
     <w:p>
@@ -29,7 +29,7 @@
           <w:color w:val="555555"/>
           <w:sz w:val="21"/>
         </w:rPr>
-        <w:t>Сформировано на основе прямого аудита через MCP ChatPlace Virale (@tolikus, ниша Family Relationships)</w:t>
+        <w:t>Точная привязка сценариев к существующим активным автоворонкам и ключевым словам бота (@tolikus)</w:t>
         <w:br/>
         <w:t>Спикер: Федоров Анатолий Игоревич (Семейный психолог, гипнолог, проректор МАГиГ)</w:t>
       </w:r>
@@ -45,7 +45,7 @@
           <w:color w:val="1F4E5B"/>
           <w:sz w:val="26"/>
         </w:rPr>
-        <w:t>РАЗДЕЛ 0: ДАННЫЕ АНАЛИТИКИ VIRALE ДЛЯ АККАУНТА @TOLIKUS</w:t>
+        <w:t>РАЗДЕЛ 0: РЕЕСТР БОЕВЫХ АВТОМАТИЗАЦИЙ В CHATPLACE</w:t>
       </w:r>
     </w:p>
     <w:p>
@@ -58,7 +58,7 @@
           <w:b/>
           <w:sz w:val="20"/>
         </w:rPr>
-        <w:t xml:space="preserve">Позиция в нише: </w:t>
+        <w:t xml:space="preserve">Боевые триггеры: </w:t>
       </w:r>
       <w:r>
         <w:rPr>
@@ -66,7 +66,7 @@
           <w:i w:val="0"/>
           <w:sz w:val="20"/>
         </w:rPr>
-        <w:t>Engagement Rate в топ 9.8% ниши (6.84% при норме 2.73%), но охваты ниже потенциала из-за дефицита эмоциональных микро-хуков и CTA.</w:t>
+        <w:t>В боте уже настроены и активированы 5 боевых автоворонок с выдачей разборов и гайдов. Каждый Reels обязан вести строго на своё уникальное ключевое слово:</w:t>
       </w:r>
     </w:p>
     <w:p>
@@ -79,7 +79,7 @@
           <w:b/>
           <w:sz w:val="20"/>
         </w:rPr>
-        <w:t xml:space="preserve">Ключевые инсайты алгоритма: </w:t>
+        <w:t xml:space="preserve">Карта соответствия: </w:t>
       </w:r>
       <w:r>
         <w:rPr>
@@ -87,13 +87,17 @@
           <w:i w:val="0"/>
           <w:sz w:val="20"/>
         </w:rPr>
-        <w:t>1. Оптимальный хронометраж: 30–50 секунд (sweet spot ниши).</w:t>
+        <w:t>1. Кодовое слово: «ДИАЛОГ» ➔ Разбор: «Почему в ссоре мы ругаемся не из-за быта и как говорить без обвинений».</w:t>
         <w:br/>
-        <w:t>2. Топовый формат ниши: Storytelling + Personal Confession (65.45% рынка, средний вирусный скор 54.5).</w:t>
+        <w:t>2. Кодовое слово: «ПАУЗА» ➔ Инструкция: «Правило 20 минут тишины при ссоре: как не наговорить лишнего».</w:t>
         <w:br/>
-        <w:t>3. Топовый тип хука: Emotional + Visual Text (80.91% ниши).</w:t>
+        <w:t>3. Кодовое слово: «ВОЗДУХ» ➔ Практика: «Что делать, когда партнер закрылся и молчит: снятие тревоги».</w:t>
         <w:br/>
-        <w:t>4. Проблема аккаунта: только 9.09% роликов имели CTA. Нужно 100% внедрение четкого CTA на слово-триггер ТЕСТ.</w:t>
+        <w:t>4. Кодовое слово: «СИЛА» ➔ Руководство: «Как говорить с мужчиной, чтобы он слышал, а не ложился на диван».</w:t>
+        <w:br/>
+        <w:t>5. Кодовое слово: «ГРАНИЦЫ» ➔ Чек-лист: «5 фраз свекрови/родственников, нарушающих границы семьи».</w:t>
+        <w:br/>
+        <w:t>6. Кодовое слово: «ДЕНЬГИ» ➔ Регистрация на вебинар «Деньги и Родовые сценарии».</w:t>
       </w:r>
     </w:p>
     <w:p>
@@ -107,7 +111,7 @@
           <w:color w:val="1F4E5B"/>
           <w:sz w:val="26"/>
         </w:rPr>
-        <w:t>РАЗДЕЛ 1: СЪЕМОЧНЫЕ СЦЕНАРИИ 6 REELS (ПО ПАТТЕРНАМ VIRALE)</w:t>
+        <w:t>РАЗДЕЛ 1: СЪЕМОЧНЫЕ СЦЕНАРИИ 6 REELS ДЛЯ ТЕЛЕСУФЛЁРА</w:t>
       </w:r>
     </w:p>
     <w:p>
@@ -121,7 +125,7 @@
           <w:color w:val="0E6E5D"/>
           <w:sz w:val="23"/>
         </w:rPr>
-        <w:t>🎬 REELS 1 (Паттерн Virale: emotional_family_hook + storytelling_personal_confession)</w:t>
+        <w:t>🎬 REELS 1 (Триггер: «ДИАЛОГ») — «Претензия — это крик об одиночестве»</w:t>
       </w:r>
     </w:p>
     <w:p>
@@ -136,7 +140,7 @@
           <w:color w:val="C0392B"/>
           <w:sz w:val="20"/>
         </w:rPr>
-        <w:t>МЕТРИКИ VIRALE</w:t>
+        <w:t>МЕТРИКИ И ПРИВЯЗКА</w:t>
         <w:br/>
       </w:r>
       <w:r>
@@ -144,7 +148,11 @@
           <w:rFonts w:ascii="Calibri" w:hAnsi="Calibri"/>
           <w:sz w:val="19"/>
         </w:rPr>
-        <w:t>Хронометраж: 35 сек. Эмоция: Revelation + Love. Хук: Текстовый оверлей + личное признание.</w:t>
+        <w:t>• Хронометраж: 35 сек. Формат: Storytelling / Откровение.</w:t>
+        <w:br/>
+        <w:t>• Активная автоворонка в ChatPlace: «Автоматизация: ДИАЛОГ»</w:t>
+        <w:br/>
+        <w:t>• Выдача в директ: Разбор перестройки общения без упреков.</w:t>
       </w:r>
     </w:p>
     <w:p>
@@ -157,7 +165,7 @@
           <w:b/>
           <w:sz w:val="20"/>
         </w:rPr>
-        <w:t xml:space="preserve">Текстовый хук: </w:t>
+        <w:t xml:space="preserve">Текстовый оверлей: </w:t>
       </w:r>
       <w:r>
         <w:rPr>
@@ -165,7 +173,7 @@
           <w:i w:val="0"/>
           <w:sz w:val="20"/>
         </w:rPr>
-        <w:t>Текст на экране (первые 3 сек): «Почему деньги уходят, когда дома холодно?»</w:t>
+        <w:t>Текст на экране (первые 3 сек): «О чем кричит женщина, когда пилит за посуду?»</w:t>
       </w:r>
     </w:p>
     <w:p>
@@ -186,13 +194,16 @@
           <w:i/>
           <w:sz w:val="20"/>
         </w:rPr>
-        <w:t>«За 15 лет практики я заметил жесткую закономерность: как только в семье начинается затяжная молчанка или скрытые упреки — у мужчины или женщины моментально проседает доход.</w:t>
+        <w:t>«Когда женщина со вздохом говорит: «Ты вечно в телефоне!» — она кричит вовсе не о телефоне. Внутри звучит: «Мне одиноко. Я боюсь стать тебе чужой».</w:t>
         <w:br/>
         <w:br/>
-        <w:t>И дело не в эзотерике. Мозг устроен так: чтобы зарабатывать и рисковать в бизнесе, психике нужен безопасный тыл. Когда дома война — 90% энергии уходит на оборону и тревогу. Вы физически не можете видеть финансовые возможности.</w:t>
+        <w:t>А мужчина слышит упрек, думает «я опять во всем виноват» и закрывается еще глубже. Цикл замкнулся.</w:t>
         <w:br/>
         <w:br/>
-        <w:t>Хотите вернуть тыл и финансовый рост? Напишите слово ТЕСТ в комментарии — пришлю экспресс-диагностику вашего семейного сценария».</w:t>
+        <w:t>Уберите слова «ты вечно» и «ты никогда». Скажите просто о себе: «Я не хочу ругаться. Я соскучилась и хочу побыть с тобой».</w:t>
+        <w:br/>
+        <w:br/>
+        <w:t>Напишите в комментариях слово ДИАЛОГ — я пришлю вам в директ разбор, как перестроить общение в паре, чтобы вас наконец услышали».</w:t>
       </w:r>
     </w:p>
     <w:p>
@@ -206,7 +217,7 @@
           <w:color w:val="0E6E5D"/>
           <w:sz w:val="23"/>
         </w:rPr>
-        <w:t>🎬 REELS 2 (Паттерн Virale: medium_story_30_60 + trigger_words)</w:t>
+        <w:t>🎬 REELS 2 (Триггер: «ПАУЗА») — «Никогда не продолжай ссору при пульсе 100»</w:t>
       </w:r>
     </w:p>
     <w:p>
@@ -221,7 +232,7 @@
           <w:color w:val="C0392B"/>
           <w:sz w:val="20"/>
         </w:rPr>
-        <w:t>МЕТРИКИ VIRALE</w:t>
+        <w:t>МЕТРИКИ И ПРИВЯЗКА</w:t>
         <w:br/>
       </w:r>
       <w:r>
@@ -229,7 +240,11 @@
           <w:rFonts w:ascii="Calibri" w:hAnsi="Calibri"/>
           <w:sz w:val="19"/>
         </w:rPr>
-        <w:t>Хронометраж: 40 сек. Эмоция: Shock + Relief. Хук: Запрет на фатальную ошибку.</w:t>
+        <w:t>• Хронометраж: 40 сек. Формат: Экспертное предостережение.</w:t>
+        <w:br/>
+        <w:t>• Активная автоворонка в ChatPlace: «Автоматизация: ПАУЗА»</w:t>
+        <w:br/>
+        <w:t>• Выдача в директ: Алгоритм остановки ссоры за 20 минут.</w:t>
       </w:r>
     </w:p>
     <w:p>
@@ -242,7 +257,7 @@
           <w:b/>
           <w:sz w:val="20"/>
         </w:rPr>
-        <w:t xml:space="preserve">Текстовый хук: </w:t>
+        <w:t xml:space="preserve">Текстовый оверлей: </w:t>
       </w:r>
       <w:r>
         <w:rPr>
@@ -250,7 +265,7 @@
           <w:i w:val="0"/>
           <w:sz w:val="20"/>
         </w:rPr>
-        <w:t>Текст на экране: «Никогда не продолжай ссору, если колотится сердце»</w:t>
+        <w:t>Текст на экране: «Никогда не спорь, если заколотилось сердце»</w:t>
       </w:r>
     </w:p>
     <w:p>
@@ -271,16 +286,15 @@
           <w:i/>
           <w:sz w:val="20"/>
         </w:rPr>
-        <w:t>«Никогда не выясняйте отношения, если чувствуете, что пульс подскочил. В этот момент вы биологически не способны слышать партнера.</w:t>
+        <w:t>«В момент ссоры спорить бесполезно. Когда пульс поднимается выше 100 ударов — мозг перегружен стрессом, логика отключается. Всё, что выкрикивается — это не факты, а взаимная боль.</w:t>
         <w:br/>
         <w:br/>
-        <w:t>Профессор Джон Готтман доказал: как только сердце бьется быстрее 100 ударов в минуту — кора мозга отключается. Вы можете только нападать или защищаться. Каждое слово в этом состоянии — яд.</w:t>
+        <w:t>Как остановиться, пока не разрушили семью:</w:t>
+        <w:br/>
+        <w:t>Скажите вслух: «Мы сейчас наговорим лишнего. Давай сделаем паузу на 20 минут». И физически разойдитесь по разным комнатам. Ровно 20 минут нужно организму, чтобы расщепить кортизол.</w:t>
         <w:br/>
         <w:br/>
-        <w:t>Скажите: «Мы закипаем. Пауза 20 минут». Ровно 20 минут разделения комнат спасают брак от развода.</w:t>
-        <w:br/>
-        <w:br/>
-        <w:t>Напишите слово ТЕСТ в комментарии, чтобы узнать, какой скрытый сценарий ссор разрушает вашу пару».</w:t>
+        <w:t>Напишите слово ПАУЗА в комментарии — пришлю пошаговую инструкцию, как правильно выходить из ссор».</w:t>
       </w:r>
     </w:p>
     <w:p>
@@ -294,7 +308,7 @@
           <w:color w:val="0E6E5D"/>
           <w:sz w:val="23"/>
         </w:rPr>
-        <w:t>🎬 REELS 3 (Паттерн Virale: mystery_revelation_hook + curiosity)</w:t>
+        <w:t>🎬 REELS 3 (Триггер: «ВОЗДУХ») — «Что делать, когда партнер закрылся и молчит»</w:t>
       </w:r>
     </w:p>
     <w:p>
@@ -309,7 +323,7 @@
           <w:color w:val="C0392B"/>
           <w:sz w:val="20"/>
         </w:rPr>
-        <w:t>МЕТРИКИ VIRALE</w:t>
+        <w:t>МЕТРИКИ И ПРИВЯЗКА</w:t>
         <w:br/>
       </w:r>
       <w:r>
@@ -317,7 +331,11 @@
           <w:rFonts w:ascii="Calibri" w:hAnsi="Calibri"/>
           <w:sz w:val="19"/>
         </w:rPr>
-        <w:t>Хронометраж: 35 сек. Эмоция: Revelation. Хук: Парадокс выбора.</w:t>
+        <w:t>• Хронометраж: 38 сек. Формат: Личное сочувствие и снятие паники.</w:t>
+        <w:br/>
+        <w:t>• Активная автоворонка в ChatPlace: «Автоматизация: ВОЗДУХ»</w:t>
+        <w:br/>
+        <w:t>• Выдача в директ: Практика снятия тревоги при молчании партнера.</w:t>
       </w:r>
     </w:p>
     <w:p>
@@ -330,7 +348,7 @@
           <w:b/>
           <w:sz w:val="20"/>
         </w:rPr>
-        <w:t xml:space="preserve">Текстовый хук: </w:t>
+        <w:t xml:space="preserve">Текстовый оверлей: </w:t>
       </w:r>
       <w:r>
         <w:rPr>
@@ -338,7 +356,7 @@
           <w:i w:val="0"/>
           <w:sz w:val="20"/>
         </w:rPr>
-        <w:t>Текст на экране: «Почему с хорошими пресно, а тянет к сложным?»</w:t>
+        <w:t>Текст на экране: «Он молчит не потому, что разлюбил»</w:t>
       </w:r>
     </w:p>
     <w:p>
@@ -359,13 +377,16 @@
           <w:i/>
           <w:sz w:val="20"/>
         </w:rPr>
-        <w:t>«Почему рядом с заботливым и надежным человеком вам скучно и «нет искры», а ради холодного и недоступного вы готовы не спать ночами и терпеть качели?</w:t>
+        <w:t>«Когда близкий человек закрывается и молчит, внутри нарастает паника: «Я сделала что-то не так? Я больше не нужна?». Рука сама тянется к телефону или хочется выбить дверь с допросом.</w:t>
         <w:br/>
         <w:br/>
-        <w:t>Потому что ваш мозг с детства привык путать тревогу со страстью. Если любовь приходилось заслуживать, спокойные отношения кажутся чужими, а эмоциональный ад — настоящей любовью.</w:t>
+        <w:t>Остановитесь. Мужчина уходит в молчание не чтобы наказать вас. У него просто кончились силы, и мозг ушел в перезагрузку.</w:t>
         <w:br/>
         <w:br/>
-        <w:t>Как перенастроить свой радар? Напишите слово ТЕСТ в комментарии — я пришлю вам 2-минутный тест и разбор вашего типа привязанности».</w:t>
+        <w:t>Положите руку на грудь, сделайте три медленных выдоха и займитесь своими делами. Когда дома покой — мужчина возвращается к диалогу сам.</w:t>
+        <w:br/>
+        <w:br/>
+        <w:t>Напишите слово ВОЗДУХ в комментарии — пришлю практику снятия паники и правила поведения при молчанке».</w:t>
       </w:r>
     </w:p>
     <w:p>
@@ -379,7 +400,7 @@
           <w:color w:val="0E6E5D"/>
           <w:sz w:val="23"/>
         </w:rPr>
-        <w:t>🎬 REELS 4 (Паттерн Virale: culture_reveal_story + boundary_loss)</w:t>
+        <w:t>🎬 REELS 4 (Триггер: «СИЛА») — «Как говорить с мужчиной, чтобы он встал с дивана»</w:t>
       </w:r>
     </w:p>
     <w:p>
@@ -394,7 +415,7 @@
           <w:color w:val="C0392B"/>
           <w:sz w:val="20"/>
         </w:rPr>
-        <w:t>МЕТРИКИ VIRALE</w:t>
+        <w:t>МЕТРИКИ И ПРИВЯЗКА</w:t>
         <w:br/>
       </w:r>
       <w:r>
@@ -402,7 +423,11 @@
           <w:rFonts w:ascii="Calibri" w:hAnsi="Calibri"/>
           <w:sz w:val="19"/>
         </w:rPr>
-        <w:t>Хронометраж: 38 сек. Эмоция: Resentment ➔ Sovereignty. Хук: Разоблачение ловушки угождения.</w:t>
+        <w:t>• Хронометраж: 38 сек. Формат: Мужская психология без иллюзий.</w:t>
+        <w:br/>
+        <w:t>• Активная автоворонка в ChatPlace: «Автоматизация: СИЛА»</w:t>
+        <w:br/>
+        <w:t>• Выдача в директ: Руководство по женской коммуникации с мужчиной.</w:t>
       </w:r>
     </w:p>
     <w:p>
@@ -415,7 +440,7 @@
           <w:b/>
           <w:sz w:val="20"/>
         </w:rPr>
-        <w:t xml:space="preserve">Текстовый хук: </w:t>
+        <w:t xml:space="preserve">Текстовый оверлей: </w:t>
       </w:r>
       <w:r>
         <w:rPr>
@@ -423,7 +448,7 @@
           <w:i w:val="0"/>
           <w:sz w:val="20"/>
         </w:rPr>
-        <w:t>Текст на экране: «Почему удобных людей не любят, а используют»</w:t>
+        <w:t>Текст на экране: «На критику мужчина реагирует диваном или агрессией»</w:t>
       </w:r>
     </w:p>
     <w:p>
@@ -444,16 +469,18 @@
           <w:i/>
           <w:sz w:val="20"/>
         </w:rPr>
-        <w:t xml:space="preserve">«Вам кажется: если вы будете идеальным, будете сглаживать все углы и предугадывать желания партнера — вас будут носить на руках. </w:t>
+        <w:t>«На упреки и поучения мужчина реагирует только двумя способами: либо взрывается агрессией, либо ложится на диван и отгораживается.</w:t>
         <w:br/>
         <w:br/>
-        <w:t>Но в реальности всё наоборот: чем больше вы растворяетесь и угождаете, тем быстрее об вас начинают вытирать ноги.</w:t>
+        <w:t>Как сказать то же самое, чтобы он захотел действовать?</w:t>
+        <w:br/>
+        <w:t>Вместо «Ты вечно забываешь» — покажите веру в него: «Мне важно, чтобы вопрос решился. Знаю, как ты загружен, но верю, что ты справишься».</w:t>
         <w:br/>
         <w:br/>
-        <w:t>Удобство вызывает не любовь, а скуку и раздражение. Любят тех, у кого есть свои границы и право сказать твердое «нет».</w:t>
+        <w:t>Простое «Спасибо за заботу, с тобой мне спокойно» дает мужчине в 10 раз больше сил, чем сотни скандалов.</w:t>
         <w:br/>
         <w:br/>
-        <w:t>Хотите вернуть уважение к себе? Напишите слово ТЕСТ — пришлю практику восстановления личных границ».</w:t>
+        <w:t>Напишите слово СИЛА в комментарии — отправлю в директ руководство, как мотивировать мужчину делами, а не упреками».</w:t>
       </w:r>
     </w:p>
     <w:p>
@@ -467,7 +494,7 @@
           <w:color w:val="0E6E5D"/>
           <w:sz w:val="23"/>
         </w:rPr>
-        <w:t>🎬 REELS 5 (Паттерн Virale: loss_reflection_arc + emergency_protection)</w:t>
+        <w:t>🎬 REELS 5 (Триггер: «ГРАНИЦЫ») — «5 фраз свекрови, которые разрушают семью»</w:t>
       </w:r>
     </w:p>
     <w:p>
@@ -482,7 +509,7 @@
           <w:color w:val="C0392B"/>
           <w:sz w:val="20"/>
         </w:rPr>
-        <w:t>МЕТРИКИ VIRALE</w:t>
+        <w:t>МЕТРИКИ И ПРИВЯЗКА</w:t>
         <w:br/>
       </w:r>
       <w:r>
@@ -490,7 +517,11 @@
           <w:rFonts w:ascii="Calibri" w:hAnsi="Calibri"/>
           <w:sz w:val="19"/>
         </w:rPr>
-        <w:t>Хронометраж: 42 сек. Эмоция: Sadness ➔ Dignity. Хук: Остановка роковой ошибки в шторм.</w:t>
+        <w:t>• Хронометраж: 40 сек. Формат: Разоблачение скрытых манипуляций.</w:t>
+        <w:br/>
+        <w:t>• Активная автоворонка в ChatPlace: ««ГРАНИЦЫ» to Direct or Comment»</w:t>
+        <w:br/>
+        <w:t>• Выдача в директ: Чек-лист 5 фраз свекрови/родственников.</w:t>
       </w:r>
     </w:p>
     <w:p>
@@ -503,7 +534,7 @@
           <w:b/>
           <w:sz w:val="20"/>
         </w:rPr>
-        <w:t xml:space="preserve">Текстовый хук: </w:t>
+        <w:t xml:space="preserve">Текстовый оверлей: </w:t>
       </w:r>
       <w:r>
         <w:rPr>
@@ -511,7 +542,7 @@
           <w:i w:val="0"/>
           <w:sz w:val="20"/>
         </w:rPr>
-        <w:t>Текст на экране: «Первые 14 дней кризиса: что разрушит всё»</w:t>
+        <w:t>Текст на экране: «Когда забота родителей становится ядом для брака»</w:t>
       </w:r>
     </w:p>
     <w:p>
@@ -532,16 +563,15 @@
           <w:i/>
           <w:sz w:val="20"/>
         </w:rPr>
-        <w:t>«Если в семье произошла измена или прозвучало слово «развод» — худшее, что можно сделать, это устроить ночные допросы или тотальную слежку в телефоне.</w:t>
+        <w:t>««Я же добра вам желаю!», «А вот в наше время…», «Ты его совсем не кормишь» — эти фразы родственников звучат как забота, но на самом деле разрушают границы вашей семьи.</w:t>
         <w:br/>
         <w:br/>
-        <w:t>Каждая новая деталь не приносит облегчения. Она превращается в навязчивые картины, которые сжигают остатки вашей нервной системы и убивают достоинство.</w:t>
+        <w:t>Если вовремя не выстроить границу, чужие советы разорвут ваш брак на части. Семья — это суверенная территория, где правила устанавливают только двое.</w:t>
         <w:br/>
         <w:br/>
-        <w:t>В первые 14 дней вводится железный мораторий на разборки. Сначала заземлите тело и верните сон.</w:t>
+        <w:t>Как защитить свой дом без скандалов с родителями?</w:t>
         <w:br/>
-        <w:br/>
-        <w:t>Напишите слово ТЕСТ в комментарии — пришлю пошаговую инструкцию, как пережить острый кризис и не сломаться».</w:t>
+        <w:t>Напишите слово ГРАНИЦЫ в комментарии — пришлю чек-лист из 5 скрытых манипуляций родственников и готовые ответы на них».</w:t>
       </w:r>
     </w:p>
     <w:p>
@@ -555,7 +585,7 @@
           <w:color w:val="0E6E5D"/>
           <w:sz w:val="23"/>
         </w:rPr>
-        <w:t>🎬 REELS 6 (Паттерн Virale: forbidden_knowledge_hook + webinar_bridge)</w:t>
+        <w:t>🎬 REELS 6 (Триггер: «ДЕНЬГИ») — «Денежный потолок: чей сценарий вы проживаете?»</w:t>
       </w:r>
     </w:p>
     <w:p>
@@ -570,7 +600,7 @@
           <w:color w:val="C0392B"/>
           <w:sz w:val="20"/>
         </w:rPr>
-        <w:t>МЕТРИКИ VIRALE</w:t>
+        <w:t>МЕТРИКИ И ПРИВЯЗКА</w:t>
         <w:br/>
       </w:r>
       <w:r>
@@ -578,7 +608,9 @@
           <w:rFonts w:ascii="Calibri" w:hAnsi="Calibri"/>
           <w:sz w:val="19"/>
         </w:rPr>
-        <w:t>Хронометраж: 40 сек. Эмоция: Curiosity + Hope. Хук: Скрытый родовая лояльность к бедности.</w:t>
+        <w:t>• Хронометраж: 42 сек. Формат: Мост к вебинару.</w:t>
+        <w:br/>
+        <w:t>• Назначение: Регистрация на вебинар «Деньги и Родовые сценарии».</w:t>
       </w:r>
     </w:p>
     <w:p>
@@ -591,7 +623,7 @@
           <w:b/>
           <w:sz w:val="20"/>
         </w:rPr>
-        <w:t xml:space="preserve">Текстовый хук: </w:t>
+        <w:t xml:space="preserve">Текстовый оверлей: </w:t>
       </w:r>
       <w:r>
         <w:rPr>
@@ -599,7 +631,7 @@
           <w:i w:val="0"/>
           <w:sz w:val="20"/>
         </w:rPr>
-        <w:t>Текст на экране: «Денежный потолок: чей сценарий вы проживаете?»</w:t>
+        <w:t>Текст на экране: «Почему доход падает, когда в семье кризис?»</w:t>
       </w:r>
     </w:p>
     <w:p>
@@ -620,13 +652,16 @@
           <w:i/>
           <w:sz w:val="20"/>
         </w:rPr>
-        <w:t>«Вы можете прочитать сотни книг по бизнесу, но если доход упирается в невидимую планку — дело в родовой лояльности.</w:t>
+        <w:t>«Вы можете пахать без выходных, но если доход упирается в одну и ту же планку — дело в родовом сценарии и обстановке дома.</w:t>
         <w:br/>
         <w:br/>
-        <w:t>Если в роду было раскулачивание или бедность, подсознание ставит блок: «Большие деньги опасны, из-за них можно потерять семью». И как только доход растет — мозг находит способ слить деньги через непредвиденные траты или семейные ссоры.</w:t>
+        <w:t>Если в роду было раскулачивание, подсознание ставит блок: «Деньги опасны». А если дома постоянные упреки — мозг тратит всю энергию на защиту, перекрывая финансовое чутье.</w:t>
         <w:br/>
         <w:br/>
-        <w:t>Завтра я провожу большой закрытый вебинар «Деньги и Семейные сценарии». Напишите слово ДЕНЬГИ в комментарии — пришлю ссылку на регистрацию».</w:t>
+        <w:t>Завтра я провожу закрытый практический вебинар «Деньги и Семейные сценарии», где разберу 4 родовых блока и дам живую практику.</w:t>
+        <w:br/>
+        <w:br/>
+        <w:t>Напишите слово ДЕНЬГИ в комментарии — пришлю вам персональное приглашение и доступ к эфиру».</w:t>
       </w:r>
     </w:p>
     <w:p>
@@ -791,7 +826,7 @@
           <w:i w:val="0"/>
           <w:sz w:val="20"/>
         </w:rPr>
-        <w:t>• Презентация глубокого 4-недельного курса / личного наставничества по трансформации сценариев.</w:t>
+        <w:t>• Презентация глубокого курса / личного наставничества по трансформации сценариев.</w:t>
         <w:br/>
         <w:t>• Спецпредложение для участников вебинара.</w:t>
         <w:br/>

</xml_diff>

<commit_message>
content: add complete verbatim Direct auto-reply messages and guides for all 6 Reels keyword triggers
</commit_message>
<xml_diff>
--- a/baza/исходник миникурса/ПЛАН_СЪЕМОК_РИЛС_И_ВЕБИНАР_ДЕНЬГИ_И_СЦЕНАРИИ.docx
+++ b/baza/исходник миникурса/ПЛАН_СЪЕМОК_РИЛС_И_ВЕБИНАР_ДЕНЬГИ_И_СЦЕНАРИИ.docx
@@ -14,7 +14,7 @@
           <w:color w:val="1F4E5B"/>
           <w:sz w:val="34"/>
         </w:rPr>
-        <w:t>СЪЕМОЧНЫЙ ПАКЕТ: 6 REELS ПОД БОЕВЫЕ АВТОМАТИЗАЦИИ CHATPLACE</w:t>
+        <w:t>СЪЕМОЧНЫЙ ПАКЕТ REELS + ВЫДАЧА В DIRECT + ВЕБИНАР «ДЕНЬГИ»</w:t>
       </w:r>
     </w:p>
     <w:p>
@@ -29,7 +29,7 @@
           <w:color w:val="555555"/>
           <w:sz w:val="21"/>
         </w:rPr>
-        <w:t>Точная привязка сценариев к существующим активным автоворонкам и ключевым словам бота (@tolikus)</w:t>
+        <w:t>Сценарий видео для суфлёра + Точный текст выдачи в Direct под каждое кодовое слово + План вебинара</w:t>
         <w:br/>
         <w:t>Спикер: Федоров Анатолий Игоревич (Семейный психолог, гипнолог, проректор МАГиГ)</w:t>
       </w:r>
@@ -45,73 +45,7 @@
           <w:color w:val="1F4E5B"/>
           <w:sz w:val="26"/>
         </w:rPr>
-        <w:t>РАЗДЕЛ 0: РЕЕСТР БОЕВЫХ АВТОМАТИЗАЦИЙ В CHATPLACE</w:t>
-      </w:r>
-    </w:p>
-    <w:p>
-      <w:pPr>
-        <w:spacing w:after="80" w:line="276" w:lineRule="auto"/>
-      </w:pPr>
-      <w:r>
-        <w:rPr>
-          <w:rFonts w:ascii="Calibri" w:hAnsi="Calibri"/>
-          <w:b/>
-          <w:sz w:val="20"/>
-        </w:rPr>
-        <w:t xml:space="preserve">Боевые триггеры: </w:t>
-      </w:r>
-      <w:r>
-        <w:rPr>
-          <w:rFonts w:ascii="Calibri" w:hAnsi="Calibri"/>
-          <w:i w:val="0"/>
-          <w:sz w:val="20"/>
-        </w:rPr>
-        <w:t>В боте уже настроены и активированы 5 боевых автоворонок с выдачей разборов и гайдов. Каждый Reels обязан вести строго на своё уникальное ключевое слово:</w:t>
-      </w:r>
-    </w:p>
-    <w:p>
-      <w:pPr>
-        <w:spacing w:after="80" w:line="276" w:lineRule="auto"/>
-      </w:pPr>
-      <w:r>
-        <w:rPr>
-          <w:rFonts w:ascii="Calibri" w:hAnsi="Calibri"/>
-          <w:b/>
-          <w:sz w:val="20"/>
-        </w:rPr>
-        <w:t xml:space="preserve">Карта соответствия: </w:t>
-      </w:r>
-      <w:r>
-        <w:rPr>
-          <w:rFonts w:ascii="Calibri" w:hAnsi="Calibri"/>
-          <w:i w:val="0"/>
-          <w:sz w:val="20"/>
-        </w:rPr>
-        <w:t>1. Кодовое слово: «ДИАЛОГ» ➔ Разбор: «Почему в ссоре мы ругаемся не из-за быта и как говорить без обвинений».</w:t>
-        <w:br/>
-        <w:t>2. Кодовое слово: «ПАУЗА» ➔ Инструкция: «Правило 20 минут тишины при ссоре: как не наговорить лишнего».</w:t>
-        <w:br/>
-        <w:t>3. Кодовое слово: «ВОЗДУХ» ➔ Практика: «Что делать, когда партнер закрылся и молчит: снятие тревоги».</w:t>
-        <w:br/>
-        <w:t>4. Кодовое слово: «СИЛА» ➔ Руководство: «Как говорить с мужчиной, чтобы он слышал, а не ложился на диван».</w:t>
-        <w:br/>
-        <w:t>5. Кодовое слово: «ГРАНИЦЫ» ➔ Чек-лист: «5 фраз свекрови/родственников, нарушающих границы семьи».</w:t>
-        <w:br/>
-        <w:t>6. Кодовое слово: «ДЕНЬГИ» ➔ Регистрация на вебинар «Деньги и Родовые сценарии».</w:t>
-      </w:r>
-    </w:p>
-    <w:p>
-      <w:pPr>
-        <w:spacing w:before="280" w:after="60"/>
-      </w:pPr>
-      <w:r>
-        <w:rPr>
-          <w:rFonts w:ascii="Calibri" w:hAnsi="Calibri"/>
-          <w:b/>
-          <w:color w:val="1F4E5B"/>
-          <w:sz w:val="26"/>
-        </w:rPr>
-        <w:t>РАЗДЕЛ 1: СЪЕМОЧНЫЕ СЦЕНАРИИ 6 REELS ДЛЯ ТЕЛЕСУФЛЁРА</w:t>
+        <w:t>РАЗДЕЛ 1: 6 REELS + ГОТОВЫЙ ТЕКСТ ВЫДАЧИ В DIRECT</w:t>
       </w:r>
     </w:p>
     <w:p>
@@ -125,7 +59,7 @@
           <w:color w:val="0E6E5D"/>
           <w:sz w:val="23"/>
         </w:rPr>
-        <w:t>🎬 REELS 1 (Триггер: «ДИАЛОГ») — «Претензия — это крик об одиночестве»</w:t>
+        <w:t>🎬 REELS 1 (Кодовое слово: «ДИАЛОГ») — «Претензия — это крик об одиночестве»</w:t>
       </w:r>
     </w:p>
     <w:p>
@@ -140,7 +74,7 @@
           <w:color w:val="C0392B"/>
           <w:sz w:val="20"/>
         </w:rPr>
-        <w:t>МЕТРИКИ И ПРИВЯЗКА</w:t>
+        <w:t>ПАРАМЕТРЫ СЪЕМКИ</w:t>
         <w:br/>
       </w:r>
       <w:r>
@@ -148,32 +82,7 @@
           <w:rFonts w:ascii="Calibri" w:hAnsi="Calibri"/>
           <w:sz w:val="19"/>
         </w:rPr>
-        <w:t>• Хронометраж: 35 сек. Формат: Storytelling / Откровение.</w:t>
-        <w:br/>
-        <w:t>• Активная автоворонка в ChatPlace: «Автоматизация: ДИАЛОГ»</w:t>
-        <w:br/>
-        <w:t>• Выдача в директ: Разбор перестройки общения без упреков.</w:t>
-      </w:r>
-    </w:p>
-    <w:p>
-      <w:pPr>
-        <w:spacing w:after="80" w:line="276" w:lineRule="auto"/>
-      </w:pPr>
-      <w:r>
-        <w:rPr>
-          <w:rFonts w:ascii="Calibri" w:hAnsi="Calibri"/>
-          <w:b/>
-          <w:sz w:val="20"/>
-        </w:rPr>
-        <w:t xml:space="preserve">Текстовый оверлей: </w:t>
-      </w:r>
-      <w:r>
-        <w:rPr>
-          <w:rFonts w:ascii="Calibri" w:hAnsi="Calibri"/>
-          <w:i w:val="0"/>
-          <w:sz w:val="20"/>
-        </w:rPr>
-        <w:t>Текст на экране (первые 3 сек): «О чем кричит женщина, когда пилит за посуду?»</w:t>
+        <w:t>Хронометраж: 35 сек. Формат: Storytelling / Личный инсайт. Оверлей: «О чем кричит женщина, когда пилит за посуду?»</w:t>
       </w:r>
     </w:p>
     <w:p>
@@ -208,6 +117,66 @@
     </w:p>
     <w:p>
       <w:pPr>
+        <w:spacing w:after="80" w:line="276" w:lineRule="auto"/>
+      </w:pPr>
+      <w:r>
+        <w:rPr>
+          <w:rFonts w:ascii="Calibri" w:hAnsi="Calibri"/>
+          <w:b/>
+          <w:sz w:val="20"/>
+        </w:rPr>
+        <w:t xml:space="preserve">Готовый текст выдачи в Direct: </w:t>
+      </w:r>
+      <w:r>
+        <w:rPr>
+          <w:rFonts w:ascii="Calibri" w:hAnsi="Calibri"/>
+          <w:i w:val="0"/>
+          <w:sz w:val="20"/>
+        </w:rPr>
+        <w:t>📩 СООБЩЕНИЕ В DIRECT (ЧТО ПРИХОДИТ ПОЛЬЗОВАТЕЛЮ ПО СЛОВУ «ДИАЛОГ»):</w:t>
+        <w:br/>
+        <w:t>«Здравствуйте! На связи Анатолий Фёдоров.</w:t>
+        <w:br/>
+        <w:br/>
+        <w:t>В большинстве ссор люди ругаются вовсе не из-за немытой посуды или быта. Люди просто боятся открыто сказать о том, что у них болит.</w:t>
+        <w:br/>
+        <w:br/>
+        <w:t>Как это выглядит на самом деле:</w:t>
+        <w:br/>
+        <w:t xml:space="preserve">• Женщина говорит: «Ты вечно в телефоне!». </w:t>
+        <w:br/>
+        <w:t>А внутри у нее звучит: «Мне одиноко, мне страшно стать тебе чужой».</w:t>
+        <w:br/>
+        <w:br/>
+        <w:t xml:space="preserve">• Мужчина огрызается: «Отстань, не выноси мозг!». </w:t>
+        <w:br/>
+        <w:t>А внутри у него: «Я адски устал и боюсь оказаться во всем виноватым».</w:t>
+        <w:br/>
+        <w:br/>
+        <w:t>🔑 Что помогает разорвать этот замкнутый круг:</w:t>
+        <w:br/>
+        <w:t>1. Полное табу на слова-обобщения: «ты вечно», «ты никогда», «ты опять».</w:t>
+        <w:br/>
+        <w:t xml:space="preserve">2. Формула «Я-сообщения»: говорите о своем чувстве, а не о чужих недостатках. </w:t>
+        <w:br/>
+        <w:t>Вместо упрека скажите: «Я не хочу ругаться. Я просто соскучилась по тебе и хочу побыть рядом».</w:t>
+        <w:br/>
+        <w:br/>
+        <w:t>Против искренности и тепла ни у кого нет желания защищаться броней.</w:t>
+        <w:br/>
+        <w:br/>
+        <w:t>👉 Как перестраивать общение в паре без ссор — подробно разбираем в моем канале «Простые вещи»:</w:t>
+        <w:br/>
+        <w:t>https://t.me/smplthing</w:t>
+        <w:br/>
+        <w:br/>
+        <w:t>🧭 А если вы хотите определить ведущий сценарий ваших отношений за 2 минуты — пройдите бесплатную диагностику:</w:t>
+        <w:br/>
+        <w:t>[Кнопка: 🧭 Пройти экспресс-тест (2 мин)]»</w:t>
+      </w:r>
+    </w:p>
+    <w:p>
+      <w:pPr>
         <w:spacing w:before="160" w:after="40"/>
       </w:pPr>
       <w:r>
@@ -217,7 +186,7 @@
           <w:color w:val="0E6E5D"/>
           <w:sz w:val="23"/>
         </w:rPr>
-        <w:t>🎬 REELS 2 (Триггер: «ПАУЗА») — «Никогда не продолжай ссору при пульсе 100»</w:t>
+        <w:t>🎬 REELS 2 (Кодовое слово: «ПАУЗА») — «Никогда не продолжай ссору при пульсе 100»</w:t>
       </w:r>
     </w:p>
     <w:p>
@@ -232,7 +201,7 @@
           <w:color w:val="C0392B"/>
           <w:sz w:val="20"/>
         </w:rPr>
-        <w:t>МЕТРИКИ И ПРИВЯЗКА</w:t>
+        <w:t>ПАРАМЕТРЫ СЪЕМКИ</w:t>
         <w:br/>
       </w:r>
       <w:r>
@@ -240,32 +209,7 @@
           <w:rFonts w:ascii="Calibri" w:hAnsi="Calibri"/>
           <w:sz w:val="19"/>
         </w:rPr>
-        <w:t>• Хронометраж: 40 сек. Формат: Экспертное предостережение.</w:t>
-        <w:br/>
-        <w:t>• Активная автоворонка в ChatPlace: «Автоматизация: ПАУЗА»</w:t>
-        <w:br/>
-        <w:t>• Выдача в директ: Алгоритм остановки ссоры за 20 минут.</w:t>
-      </w:r>
-    </w:p>
-    <w:p>
-      <w:pPr>
-        <w:spacing w:after="80" w:line="276" w:lineRule="auto"/>
-      </w:pPr>
-      <w:r>
-        <w:rPr>
-          <w:rFonts w:ascii="Calibri" w:hAnsi="Calibri"/>
-          <w:b/>
-          <w:sz w:val="20"/>
-        </w:rPr>
-        <w:t xml:space="preserve">Текстовый оверлей: </w:t>
-      </w:r>
-      <w:r>
-        <w:rPr>
-          <w:rFonts w:ascii="Calibri" w:hAnsi="Calibri"/>
-          <w:i w:val="0"/>
-          <w:sz w:val="20"/>
-        </w:rPr>
-        <w:t>Текст на экране: «Никогда не спорь, если заколотилось сердце»</w:t>
+        <w:t>Хронометраж: 40 сек. Формат: Экспертное предостережение. Оверлей: «Никогда не спорь, если заколотилось сердце»</w:t>
       </w:r>
     </w:p>
     <w:p>
@@ -299,6 +243,59 @@
     </w:p>
     <w:p>
       <w:pPr>
+        <w:spacing w:after="80" w:line="276" w:lineRule="auto"/>
+      </w:pPr>
+      <w:r>
+        <w:rPr>
+          <w:rFonts w:ascii="Calibri" w:hAnsi="Calibri"/>
+          <w:b/>
+          <w:sz w:val="20"/>
+        </w:rPr>
+        <w:t xml:space="preserve">Готовый текст выдачи в Direct: </w:t>
+      </w:r>
+      <w:r>
+        <w:rPr>
+          <w:rFonts w:ascii="Calibri" w:hAnsi="Calibri"/>
+          <w:i w:val="0"/>
+          <w:sz w:val="20"/>
+        </w:rPr>
+        <w:t>📩 СООБЩЕНИЕ В DIRECT (ЧТО ПРИХОДИТ ПОЛЬЗОВАТЕЛЮ ПО СЛОВУ «ПАУЗА»):</w:t>
+        <w:br/>
+        <w:t>«Здравствуйте! На связи Анатолий Фёдоров.</w:t>
+        <w:br/>
+        <w:br/>
+        <w:t>Держите пошаговую инструкцию «Правило 20 минут при ссоре»:</w:t>
+        <w:br/>
+        <w:br/>
+        <w:t>Когда начинается ссора, пульс подскакивает выше 100 ударов в минуту. В этот момент логика отключается, и продолжать разговор — значит гарантированно наговорить гадостей, о которых будете жалеть годами.</w:t>
+        <w:br/>
+        <w:br/>
+        <w:t>🛑 3 шага экстренной остановки ссоры:</w:t>
+        <w:br/>
+        <w:t>1. Скажите вслух простую фразу: «Мы сейчас закипаем и наговорим лишнего. Давай сделаем паузу на 20 минут».</w:t>
+        <w:br/>
+        <w:t xml:space="preserve">2. Физически разойдитесь по разным комнатам. Умойтесь прохладной водой, выпейте стакан воды, подышите. </w:t>
+        <w:br/>
+        <w:t>⚠️ ГЛАВНОЕ ПРАВИЛО: категорически запрещено прокручивать в голове обидные фразы и мысленно продолжать спор!</w:t>
+        <w:br/>
+        <w:t>3. Через 20 минут, когда адреналин схлынул, вернитесь к разговору, но начните не с претензии («Почему ты орал?»), а со спокойного: «Я хочу, чтобы мы поняли друг друга. Давай спокойно решим, как быть».</w:t>
+        <w:br/>
+        <w:br/>
+        <w:t>20 минут тишины спасают сотни нервных клеток и сохраняют брак.</w:t>
+        <w:br/>
+        <w:br/>
+        <w:t>👉 Разборы реальных семейных ситуаций — в моем Telegram-канале «Простые вещи»:</w:t>
+        <w:br/>
+        <w:t>https://t.me/smplthing</w:t>
+        <w:br/>
+        <w:br/>
+        <w:t>🧭 Пройдите тест на совместимость и сценарии ссор:</w:t>
+        <w:br/>
+        <w:t>[Кнопка: 🧭 Пройти экспресс-диагностику]»</w:t>
+      </w:r>
+    </w:p>
+    <w:p>
+      <w:pPr>
         <w:spacing w:before="160" w:after="40"/>
       </w:pPr>
       <w:r>
@@ -308,7 +305,7 @@
           <w:color w:val="0E6E5D"/>
           <w:sz w:val="23"/>
         </w:rPr>
-        <w:t>🎬 REELS 3 (Триггер: «ВОЗДУХ») — «Что делать, когда партнер закрылся и молчит»</w:t>
+        <w:t>🎬 REELS 3 (Кодовое слово: «ВОЗДУХ») — «Что делать, когда партнер закрылся и молчит»</w:t>
       </w:r>
     </w:p>
     <w:p>
@@ -323,7 +320,7 @@
           <w:color w:val="C0392B"/>
           <w:sz w:val="20"/>
         </w:rPr>
-        <w:t>МЕТРИКИ И ПРИВЯЗКА</w:t>
+        <w:t>ПАРАМЕТРЫ СЪЕМКИ</w:t>
         <w:br/>
       </w:r>
       <w:r>
@@ -331,32 +328,7 @@
           <w:rFonts w:ascii="Calibri" w:hAnsi="Calibri"/>
           <w:sz w:val="19"/>
         </w:rPr>
-        <w:t>• Хронометраж: 38 сек. Формат: Личное сочувствие и снятие паники.</w:t>
-        <w:br/>
-        <w:t>• Активная автоворонка в ChatPlace: «Автоматизация: ВОЗДУХ»</w:t>
-        <w:br/>
-        <w:t>• Выдача в директ: Практика снятия тревоги при молчании партнера.</w:t>
-      </w:r>
-    </w:p>
-    <w:p>
-      <w:pPr>
-        <w:spacing w:after="80" w:line="276" w:lineRule="auto"/>
-      </w:pPr>
-      <w:r>
-        <w:rPr>
-          <w:rFonts w:ascii="Calibri" w:hAnsi="Calibri"/>
-          <w:b/>
-          <w:sz w:val="20"/>
-        </w:rPr>
-        <w:t xml:space="preserve">Текстовый оверлей: </w:t>
-      </w:r>
-      <w:r>
-        <w:rPr>
-          <w:rFonts w:ascii="Calibri" w:hAnsi="Calibri"/>
-          <w:i w:val="0"/>
-          <w:sz w:val="20"/>
-        </w:rPr>
-        <w:t>Текст на экране: «Он молчит не потому, что разлюбил»</w:t>
+        <w:t>Хронометраж: 38 сек. Формат: Личное сочувствие. Оверлей: «Он молчит не потому, что разлюбил»</w:t>
       </w:r>
     </w:p>
     <w:p>
@@ -391,6 +363,57 @@
     </w:p>
     <w:p>
       <w:pPr>
+        <w:spacing w:after="80" w:line="276" w:lineRule="auto"/>
+      </w:pPr>
+      <w:r>
+        <w:rPr>
+          <w:rFonts w:ascii="Calibri" w:hAnsi="Calibri"/>
+          <w:b/>
+          <w:sz w:val="20"/>
+        </w:rPr>
+        <w:t xml:space="preserve">Готовый текст выдачи в Direct: </w:t>
+      </w:r>
+      <w:r>
+        <w:rPr>
+          <w:rFonts w:ascii="Calibri" w:hAnsi="Calibri"/>
+          <w:i w:val="0"/>
+          <w:sz w:val="20"/>
+        </w:rPr>
+        <w:t>📩 СООБЩЕНИЕ В DIRECT (ЧТО ПРИХОДИТ ПОЛЬЗОВАТЕЛЮ ПО СЛОВУ «ВОЗДУХ»):</w:t>
+        <w:br/>
+        <w:t>«Здравствуйте! С вами Анатолий Фёдоров.</w:t>
+        <w:br/>
+        <w:br/>
+        <w:t>Когда близкий человек закрывается и уходит в глухую молчанку, внутри почти мгновенно нарастает паника: «Я что-то сделала не так? Меня больше не любят?».</w:t>
+        <w:br/>
+        <w:br/>
+        <w:t>Рука сама тянется написать гневное сообщение или потребовать немедленного ответа.</w:t>
+        <w:br/>
+        <w:br/>
+        <w:t>🛑 Что сделать прямо сейчас, чтобы не наломать дров:</w:t>
+        <w:br/>
+        <w:t>1. Выдохните. В буквальном смысле положите руку на грудь и сделайте 3 медленных глубоких выдоха через рот. Телу нужно успокоить нервную систему.</w:t>
+        <w:br/>
+        <w:t>2. Разделите в голове его состояние и свою ценность. Мужчина молчит не потому, что хочет вас наказать. У него просто кончился эмоциональный ресурс, и он ушел в берлогу переварить стресс. Ваша ценность от его молчания никуда не делась!</w:t>
+        <w:br/>
+        <w:t>3. Оставьте закрытую дверь в покое. Налейте себе чаю, выйдите на свежий воздух, переключитесь на свои дела.</w:t>
+        <w:br/>
+        <w:br/>
+        <w:t>Когда в доме спокойно и никто не выбивает дверь с допросом — мужчина возвращается к разговору в разы быстрее.</w:t>
+        <w:br/>
+        <w:br/>
+        <w:t>👉 Практические техники для эмоциональной устойчивости — в моем канале:</w:t>
+        <w:br/>
+        <w:t>https://t.me/smplthing</w:t>
+        <w:br/>
+        <w:br/>
+        <w:t>🧭 Узнайте, склонны ли вы к эмоциональной зависимости:</w:t>
+        <w:br/>
+        <w:t>[Кнопка: 🧭 Пройти тест на эмоциональный суверенитет]»</w:t>
+      </w:r>
+    </w:p>
+    <w:p>
+      <w:pPr>
         <w:spacing w:before="160" w:after="40"/>
       </w:pPr>
       <w:r>
@@ -400,7 +423,7 @@
           <w:color w:val="0E6E5D"/>
           <w:sz w:val="23"/>
         </w:rPr>
-        <w:t>🎬 REELS 4 (Триггер: «СИЛА») — «Как говорить с мужчиной, чтобы он встал с дивана»</w:t>
+        <w:t>🎬 REELS 4 (Кодовое слово: «СИЛА») — «Как говорить с мужчиной, чтобы он встал с дивана»</w:t>
       </w:r>
     </w:p>
     <w:p>
@@ -415,7 +438,7 @@
           <w:color w:val="C0392B"/>
           <w:sz w:val="20"/>
         </w:rPr>
-        <w:t>МЕТРИКИ И ПРИВЯЗКА</w:t>
+        <w:t>ПАРАМЕТРЫ СЪЕМКИ</w:t>
         <w:br/>
       </w:r>
       <w:r>
@@ -423,32 +446,7 @@
           <w:rFonts w:ascii="Calibri" w:hAnsi="Calibri"/>
           <w:sz w:val="19"/>
         </w:rPr>
-        <w:t>• Хронометраж: 38 сек. Формат: Мужская психология без иллюзий.</w:t>
-        <w:br/>
-        <w:t>• Активная автоворонка в ChatPlace: «Автоматизация: СИЛА»</w:t>
-        <w:br/>
-        <w:t>• Выдача в директ: Руководство по женской коммуникации с мужчиной.</w:t>
-      </w:r>
-    </w:p>
-    <w:p>
-      <w:pPr>
-        <w:spacing w:after="80" w:line="276" w:lineRule="auto"/>
-      </w:pPr>
-      <w:r>
-        <w:rPr>
-          <w:rFonts w:ascii="Calibri" w:hAnsi="Calibri"/>
-          <w:b/>
-          <w:sz w:val="20"/>
-        </w:rPr>
-        <w:t xml:space="preserve">Текстовый оверлей: </w:t>
-      </w:r>
-      <w:r>
-        <w:rPr>
-          <w:rFonts w:ascii="Calibri" w:hAnsi="Calibri"/>
-          <w:i w:val="0"/>
-          <w:sz w:val="20"/>
-        </w:rPr>
-        <w:t>Текст на экране: «На критику мужчина реагирует диваном или агрессией»</w:t>
+        <w:t>Хронометраж: 38 сек. Формат: Мужская психология без иллюзий. Оверлей: «На критику мужчина реагирует диваном или агрессией»</w:t>
       </w:r>
     </w:p>
     <w:p>
@@ -485,6 +483,60 @@
     </w:p>
     <w:p>
       <w:pPr>
+        <w:spacing w:after="80" w:line="276" w:lineRule="auto"/>
+      </w:pPr>
+      <w:r>
+        <w:rPr>
+          <w:rFonts w:ascii="Calibri" w:hAnsi="Calibri"/>
+          <w:b/>
+          <w:sz w:val="20"/>
+        </w:rPr>
+        <w:t xml:space="preserve">Готовый текст выдачи в Direct: </w:t>
+      </w:r>
+      <w:r>
+        <w:rPr>
+          <w:rFonts w:ascii="Calibri" w:hAnsi="Calibri"/>
+          <w:i w:val="0"/>
+          <w:sz w:val="20"/>
+        </w:rPr>
+        <w:t>📩 СООБЩЕНИЕ В DIRECT (ЧТО ПРИХОДИТ ПОЛЬЗОВАТЕЛЮ ПО СЛОВУ «СИЛА»):</w:t>
+        <w:br/>
+        <w:t>«Здравствуйте! На связи Анатолий Фёдоров.</w:t>
+        <w:br/>
+        <w:br/>
+        <w:t>Держите руководство: «3 правила мужской мотивации без пиления»:</w:t>
+        <w:br/>
+        <w:br/>
+        <w:t>На критику и поучения мужчина реагирует одинаково: он чувствует, что его считают никчемным, и либо взрывается, либо ложится на диван.</w:t>
+        <w:br/>
+        <w:br/>
+        <w:t>🔑 Как донести просьбу, чтобы мужчина захотел действовать:</w:t>
+        <w:br/>
+        <w:t>1. Вместо упрека («Ты вечно всё забываешь!») — покажите доверие к его мужской силе:</w:t>
+        <w:br/>
+        <w:t>«Мне очень важно, чтобы вечером были продукты. Знаю, как ты устал на работе, но я уверена, что ты решишь этот вопрос».</w:t>
+        <w:br/>
+        <w:t>2. Вместо нравоучений («Делай так, как я говорю») — спросите его экспертного совета:</w:t>
+        <w:br/>
+        <w:t>«Ты отлично умеешь находить выход из сложных ситуаций. Что скажешь, если мы поступим вот так?».</w:t>
+        <w:br/>
+        <w:t>3. Замечайте и благодарите за конкретные поступки:</w:t>
+        <w:br/>
+        <w:t>Простое искреннее: «Спасибо за заботу, рядом с тобой я чувствую себя в безопасности» дает мужчине в 100 раз больше энергии стараться для семьи, чем любые претензии.</w:t>
+        <w:br/>
+        <w:br/>
+        <w:t>👉 О мужской и женской психологии простыми словами — в канале «Простые вещи»:</w:t>
+        <w:br/>
+        <w:t>https://t.me/smplthing</w:t>
+        <w:br/>
+        <w:br/>
+        <w:t>🧭 Пройдите тест на гармонию в вашей паре:</w:t>
+        <w:br/>
+        <w:t>[Кнопка: 🧭 Пройти экспресс-тест (2 мин)]»</w:t>
+      </w:r>
+    </w:p>
+    <w:p>
+      <w:pPr>
         <w:spacing w:before="160" w:after="40"/>
       </w:pPr>
       <w:r>
@@ -494,7 +546,7 @@
           <w:color w:val="0E6E5D"/>
           <w:sz w:val="23"/>
         </w:rPr>
-        <w:t>🎬 REELS 5 (Триггер: «ГРАНИЦЫ») — «5 фраз свекрови, которые разрушают семью»</w:t>
+        <w:t>🎬 REELS 5 (Кодовое слово: «ГРАНИЦЫ») — «5 фраз свекрови, которые разрушают семью»</w:t>
       </w:r>
     </w:p>
     <w:p>
@@ -509,7 +561,7 @@
           <w:color w:val="C0392B"/>
           <w:sz w:val="20"/>
         </w:rPr>
-        <w:t>МЕТРИКИ И ПРИВЯЗКА</w:t>
+        <w:t>ПАРАМЕТРЫ СЪЕМКИ</w:t>
         <w:br/>
       </w:r>
       <w:r>
@@ -517,32 +569,7 @@
           <w:rFonts w:ascii="Calibri" w:hAnsi="Calibri"/>
           <w:sz w:val="19"/>
         </w:rPr>
-        <w:t>• Хронометраж: 40 сек. Формат: Разоблачение скрытых манипуляций.</w:t>
-        <w:br/>
-        <w:t>• Активная автоворонка в ChatPlace: ««ГРАНИЦЫ» to Direct or Comment»</w:t>
-        <w:br/>
-        <w:t>• Выдача в директ: Чек-лист 5 фраз свекрови/родственников.</w:t>
-      </w:r>
-    </w:p>
-    <w:p>
-      <w:pPr>
-        <w:spacing w:after="80" w:line="276" w:lineRule="auto"/>
-      </w:pPr>
-      <w:r>
-        <w:rPr>
-          <w:rFonts w:ascii="Calibri" w:hAnsi="Calibri"/>
-          <w:b/>
-          <w:sz w:val="20"/>
-        </w:rPr>
-        <w:t xml:space="preserve">Текстовый оверлей: </w:t>
-      </w:r>
-      <w:r>
-        <w:rPr>
-          <w:rFonts w:ascii="Calibri" w:hAnsi="Calibri"/>
-          <w:i w:val="0"/>
-          <w:sz w:val="20"/>
-        </w:rPr>
-        <w:t>Текст на экране: «Когда забота родителей становится ядом для брака»</w:t>
+        <w:t>Хронометраж: 40 сек. Формат: Защита границ. Оверлей: «Когда забота родителей становится ядом для брака»</w:t>
       </w:r>
     </w:p>
     <w:p>
@@ -576,6 +603,77 @@
     </w:p>
     <w:p>
       <w:pPr>
+        <w:spacing w:after="80" w:line="276" w:lineRule="auto"/>
+      </w:pPr>
+      <w:r>
+        <w:rPr>
+          <w:rFonts w:ascii="Calibri" w:hAnsi="Calibri"/>
+          <w:b/>
+          <w:sz w:val="20"/>
+        </w:rPr>
+        <w:t xml:space="preserve">Готовый текст выдачи в Direct: </w:t>
+      </w:r>
+      <w:r>
+        <w:rPr>
+          <w:rFonts w:ascii="Calibri" w:hAnsi="Calibri"/>
+          <w:i w:val="0"/>
+          <w:sz w:val="20"/>
+        </w:rPr>
+        <w:t>📩 СООБЩЕНИЕ В DIRECT (ЧТО ПРИХОДИТ ПОЛЬЗОВАТЕЛЮ ПО СЛОВУ «ГРАНИЦЫ»):</w:t>
+        <w:br/>
+        <w:t>«Здравствуйте! С вами Анатолий Фёдоров.</w:t>
+        <w:br/>
+        <w:br/>
+        <w:t>Держите чек-лист: «5 фраз родственников, которые звучат как забота, а на деле нарушают границы вашей семьи»:</w:t>
+        <w:br/>
+        <w:br/>
+        <w:t xml:space="preserve">1. «Я же просто хочу помочь / добра вам желаю» </w:t>
+        <w:br/>
+        <w:t>➔ Скрытый смысл: контроль и навязывание своих правил.</w:t>
+        <w:br/>
+        <w:t>🛡 Ответ: «Спасибо за заботу, мы очень ценим твое участие, но в этом вопросе мы с мужем/женой разберемся сами».</w:t>
+        <w:br/>
+        <w:br/>
+        <w:t xml:space="preserve">2. «А вот в наше время мы так не делали...» </w:t>
+        <w:br/>
+        <w:t>➔ Скрытый смысл: обесценивание ваших методов воспитания или быта.</w:t>
+        <w:br/>
+        <w:t>🛡 Ответ: «Времена изменились, для нашей семьи сейчас лучше работает именно этот подход».</w:t>
+        <w:br/>
+        <w:br/>
+        <w:t xml:space="preserve">3. «Ты его/ее совсем не жалеешь / плохо кормишь» </w:t>
+        <w:br/>
+        <w:t>➔ Скрытый смысл: попытка вбить клин между супругами.</w:t>
+        <w:br/>
+        <w:t>🛡 Ответ: «У нас всё отлично, мы взрослые люди и сами распределяем свои силы».</w:t>
+        <w:br/>
+        <w:br/>
+        <w:t xml:space="preserve">4. «Вы же семья, вы обязаны приехать на все выходные» </w:t>
+        <w:br/>
+        <w:t>➔ Скрытый смысл: шантаж чувством долга и вины.</w:t>
+        <w:br/>
+        <w:t>🛡 Ответ: «В эти выходные у нас другие планы, но мы с радостью увидимся в следующий раз на пару часов».</w:t>
+        <w:br/>
+        <w:br/>
+        <w:t xml:space="preserve">5. «Не выноси сор из избы / терпи ради детей» </w:t>
+        <w:br/>
+        <w:t>➔ Скрытый смысл: призыв замалчивать проблемы и терпеть насилие.</w:t>
+        <w:br/>
+        <w:t>🛡 Ответ: «Мы строим здоровые отношения, основанные на уважении, а не на терпении обид».</w:t>
+        <w:br/>
+        <w:br/>
+        <w:t>👉 Как выстраивать границы без чувства вины — разбираем в канале «Простые вещи»:</w:t>
+        <w:br/>
+        <w:t>https://t.me/smplthing</w:t>
+        <w:br/>
+        <w:br/>
+        <w:t>🧭 Пройдите тест: «Умеете ли вы защищать личные границы»:</w:t>
+        <w:br/>
+        <w:t>[Кнопка: 🧭 Пройти тест за 2 минуты]»</w:t>
+      </w:r>
+    </w:p>
+    <w:p>
+      <w:pPr>
         <w:spacing w:before="160" w:after="40"/>
       </w:pPr>
       <w:r>
@@ -585,7 +683,7 @@
           <w:color w:val="0E6E5D"/>
           <w:sz w:val="23"/>
         </w:rPr>
-        <w:t>🎬 REELS 6 (Триггер: «ДЕНЬГИ») — «Денежный потолок: чей сценарий вы проживаете?»</w:t>
+        <w:t>🎬 REELS 6 (Кодовое слово: «ДЕНЬГИ») — «Денежный потолок: чей сценарий вы проживаете?»</w:t>
       </w:r>
     </w:p>
     <w:p>
@@ -600,7 +698,7 @@
           <w:color w:val="C0392B"/>
           <w:sz w:val="20"/>
         </w:rPr>
-        <w:t>МЕТРИКИ И ПРИВЯЗКА</w:t>
+        <w:t>ПАРАМЕТРЫ СЪЕМКИ</w:t>
         <w:br/>
       </w:r>
       <w:r>
@@ -608,30 +706,7 @@
           <w:rFonts w:ascii="Calibri" w:hAnsi="Calibri"/>
           <w:sz w:val="19"/>
         </w:rPr>
-        <w:t>• Хронометраж: 42 сек. Формат: Мост к вебинару.</w:t>
-        <w:br/>
-        <w:t>• Назначение: Регистрация на вебинар «Деньги и Родовые сценарии».</w:t>
-      </w:r>
-    </w:p>
-    <w:p>
-      <w:pPr>
-        <w:spacing w:after="80" w:line="276" w:lineRule="auto"/>
-      </w:pPr>
-      <w:r>
-        <w:rPr>
-          <w:rFonts w:ascii="Calibri" w:hAnsi="Calibri"/>
-          <w:b/>
-          <w:sz w:val="20"/>
-        </w:rPr>
-        <w:t xml:space="preserve">Текстовый оверлей: </w:t>
-      </w:r>
-      <w:r>
-        <w:rPr>
-          <w:rFonts w:ascii="Calibri" w:hAnsi="Calibri"/>
-          <w:i w:val="0"/>
-          <w:sz w:val="20"/>
-        </w:rPr>
-        <w:t>Текст на экране: «Почему доход падает, когда в семье кризис?»</w:t>
+        <w:t>Хронометраж: 42 сек. Формат: Мост к вебинару. Оверлей: «Почему доход падает, когда в семье кризис?»</w:t>
       </w:r>
     </w:p>
     <w:p>
@@ -662,6 +737,59 @@
         <w:br/>
         <w:br/>
         <w:t>Напишите слово ДЕНЬГИ в комментарии — пришлю вам персональное приглашение и доступ к эфиру».</w:t>
+      </w:r>
+    </w:p>
+    <w:p>
+      <w:pPr>
+        <w:spacing w:after="80" w:line="276" w:lineRule="auto"/>
+      </w:pPr>
+      <w:r>
+        <w:rPr>
+          <w:rFonts w:ascii="Calibri" w:hAnsi="Calibri"/>
+          <w:b/>
+          <w:sz w:val="20"/>
+        </w:rPr>
+        <w:t xml:space="preserve">Готовый текст выдачи в Direct: </w:t>
+      </w:r>
+      <w:r>
+        <w:rPr>
+          <w:rFonts w:ascii="Calibri" w:hAnsi="Calibri"/>
+          <w:i w:val="0"/>
+          <w:sz w:val="20"/>
+        </w:rPr>
+        <w:t>📩 СООБЩЕНИЕ В DIRECT (ЧТО ПРИХОДИТ ПОЛЬЗОВАТЕЛЮ ПО СЛОВУ «ДЕНЬГИ»):</w:t>
+        <w:br/>
+        <w:t>«Здравствуйте! На связи Анатолий Фёдоров.</w:t>
+        <w:br/>
+        <w:br/>
+        <w:t>Вы запросили доступ к практическому вебинару «Деньги, Род и Семья: как снять родовые блоки и увеличить финансовую емкость».</w:t>
+        <w:br/>
+        <w:br/>
+        <w:t>🗓 Дата и время эфира: Завтра в 19:00 (МСК)</w:t>
+        <w:br/>
+        <w:t>⏳ Длительность: 60 минут</w:t>
+        <w:br/>
+        <w:br/>
+        <w:t>🎯 О чем поговорим на вебинаре:</w:t>
+        <w:br/>
+        <w:t>1. 4 родовые программы бедности: «Не жили богато», «Деньги = опасность», «Деньги разрушат семью», «Заслуживание через надрыв».</w:t>
+        <w:br/>
+        <w:t>2. Почему семейные упреки и холод в доме мгновенно перекрывают финансовый рост (физиология стресса и бизнеса).</w:t>
+        <w:br/>
+        <w:t>3. Формула «Тандема силы»: как паре перестать воевать за ресурсы и начать расти в доходах вместе.</w:t>
+        <w:br/>
+        <w:t>4. Прямо в эфире: 7-минутная соматическая практика «Встреча с денежным барьером в теле» для снятия зажимов.</w:t>
+        <w:br/>
+        <w:br/>
+        <w:t>🎁 Ссылка на закрытую вебинарную комнату и напоминание придут вам за 1 час до старта.</w:t>
+        <w:br/>
+        <w:br/>
+        <w:t>👉 А пока заходите в мой Telegram-канал «Простые вещи», где я делюсь базой психологии отношений и денег:</w:t>
+        <w:br/>
+        <w:t>https://t.me/smplthing</w:t>
+        <w:br/>
+        <w:br/>
+        <w:t>[Кнопка: 🎟 Зарегистрироваться на вебинар и занять место]»</w:t>
       </w:r>
     </w:p>
     <w:p>

</xml_diff>

<commit_message>
content: strictly remove all test references; deliver 100% existing expert guides and telegram channel link in Direct
</commit_message>
<xml_diff>
--- a/baza/исходник миникурса/ПЛАН_СЪЕМОК_РИЛС_И_ВЕБИНАР_ДЕНЬГИ_И_СЦЕНАРИИ.docx
+++ b/baza/исходник миникурса/ПЛАН_СЪЕМОК_РИЛС_И_ВЕБИНАР_ДЕНЬГИ_И_СЦЕНАРИИ.docx
@@ -14,7 +14,7 @@
           <w:color w:val="1F4E5B"/>
           <w:sz w:val="34"/>
         </w:rPr>
-        <w:t>СЪЕМОЧНЫЙ ПАКЕТ REELS + ВЫДАЧА В DIRECT + ВЕБИНАР «ДЕНЬГИ»</w:t>
+        <w:t>СЪЕМОЧНЫЙ ПАКЕТ REELS + ВЫДАЧА В DIRECT (БЕЗ ТЕСТОВ) + ВЕБИНАР</w:t>
       </w:r>
     </w:p>
     <w:p>
@@ -29,7 +29,7 @@
           <w:color w:val="555555"/>
           <w:sz w:val="21"/>
         </w:rPr>
-        <w:t>Сценарий видео для суфлёра + Точный текст выдачи в Direct под каждое кодовое слово + План вебинара</w:t>
+        <w:t>Только реальные готовые гайды, разборы и канал «Простые вещи» (Никаких тестов!)</w:t>
         <w:br/>
         <w:t>Спикер: Федоров Анатолий Игоревич (Семейный психолог, гипнолог, проректор МАГиГ)</w:t>
       </w:r>
@@ -45,7 +45,7 @@
           <w:color w:val="1F4E5B"/>
           <w:sz w:val="26"/>
         </w:rPr>
-        <w:t>РАЗДЕЛ 1: 6 REELS + ГОТОВЫЙ ТЕКСТ ВЫДАЧИ В DIRECT</w:t>
+        <w:t>РАЗДЕЛ 1: 6 REELS + ТОЧНЫЙ ТЕКСТ ВЫДАЧИ В DIRECT (ТОЛЬКО РЕАЛЬНЫЙ КОНТЕНТ)</w:t>
       </w:r>
     </w:p>
     <w:p>
@@ -112,7 +112,7 @@
         <w:t>Уберите слова «ты вечно» и «ты никогда». Скажите просто о себе: «Я не хочу ругаться. Я соскучилась и хочу побыть с тобой».</w:t>
         <w:br/>
         <w:br/>
-        <w:t>Напишите в комментариях слово ДИАЛОГ — я пришлю вам в директ разбор, как перестроить общение в паре, чтобы вас наконец услышали».</w:t>
+        <w:t>Напишите в комментариях слово ДИАЛОГ — я пришлю вам в директ готовый разбор, как перестроить общение в паре, чтобы вас наконец услышали».</w:t>
       </w:r>
     </w:p>
     <w:p>
@@ -133,7 +133,7 @@
           <w:i w:val="0"/>
           <w:sz w:val="20"/>
         </w:rPr>
-        <w:t>📩 СООБЩЕНИЕ В DIRECT (ЧТО ПРИХОДИТ ПОЛЬЗОВАТЕЛЮ ПО СЛОВУ «ДИАЛОГ»):</w:t>
+        <w:t>📩 СООБЩЕНИЕ В DIRECT (ПО СЛОВУ «ДИАЛОГ»):</w:t>
         <w:br/>
         <w:t>«Здравствуйте! На связи Анатолий Фёдоров.</w:t>
         <w:br/>
@@ -167,12 +167,7 @@
         <w:br/>
         <w:t>👉 Как перестраивать общение в паре без ссор — подробно разбираем в моем канале «Простые вещи»:</w:t>
         <w:br/>
-        <w:t>https://t.me/smplthing</w:t>
-        <w:br/>
-        <w:br/>
-        <w:t>🧭 А если вы хотите определить ведущий сценарий ваших отношений за 2 минуты — пройдите бесплатную диагностику:</w:t>
-        <w:br/>
-        <w:t>[Кнопка: 🧭 Пройти экспресс-тест (2 мин)]»</w:t>
+        <w:t>https://t.me/smplthing»</w:t>
       </w:r>
     </w:p>
     <w:p>
@@ -259,7 +254,7 @@
           <w:i w:val="0"/>
           <w:sz w:val="20"/>
         </w:rPr>
-        <w:t>📩 СООБЩЕНИЕ В DIRECT (ЧТО ПРИХОДИТ ПОЛЬЗОВАТЕЛЮ ПО СЛОВУ «ПАУЗА»):</w:t>
+        <w:t>📩 СООБЩЕНИЕ В DIRECT (ПО СЛОВУ «ПАУЗА»):</w:t>
         <w:br/>
         <w:t>«Здравствуйте! На связи Анатолий Фёдоров.</w:t>
         <w:br/>
@@ -286,12 +281,7 @@
         <w:br/>
         <w:t>👉 Разборы реальных семейных ситуаций — в моем Telegram-канале «Простые вещи»:</w:t>
         <w:br/>
-        <w:t>https://t.me/smplthing</w:t>
-        <w:br/>
-        <w:br/>
-        <w:t>🧭 Пройдите тест на совместимость и сценарии ссор:</w:t>
-        <w:br/>
-        <w:t>[Кнопка: 🧭 Пройти экспресс-диагностику]»</w:t>
+        <w:t>https://t.me/smplthing»</w:t>
       </w:r>
     </w:p>
     <w:p>
@@ -379,7 +369,7 @@
           <w:i w:val="0"/>
           <w:sz w:val="20"/>
         </w:rPr>
-        <w:t>📩 СООБЩЕНИЕ В DIRECT (ЧТО ПРИХОДИТ ПОЛЬЗОВАТЕЛЮ ПО СЛОВУ «ВОЗДУХ»):</w:t>
+        <w:t>📩 СООБЩЕНИЕ В DIRECT (ПО СЛОВУ «ВОЗДУХ»):</w:t>
         <w:br/>
         <w:t>«Здравствуйте! С вами Анатолий Фёдоров.</w:t>
         <w:br/>
@@ -404,12 +394,7 @@
         <w:br/>
         <w:t>👉 Практические техники для эмоциональной устойчивости — в моем канале:</w:t>
         <w:br/>
-        <w:t>https://t.me/smplthing</w:t>
-        <w:br/>
-        <w:br/>
-        <w:t>🧭 Узнайте, склонны ли вы к эмоциональной зависимости:</w:t>
-        <w:br/>
-        <w:t>[Кнопка: 🧭 Пройти тест на эмоциональный суверенитет]»</w:t>
+        <w:t>https://t.me/smplthing»</w:t>
       </w:r>
     </w:p>
     <w:p>
@@ -499,7 +484,7 @@
           <w:i w:val="0"/>
           <w:sz w:val="20"/>
         </w:rPr>
-        <w:t>📩 СООБЩЕНИЕ В DIRECT (ЧТО ПРИХОДИТ ПОЛЬЗОВАТЕЛЮ ПО СЛОВУ «СИЛА»):</w:t>
+        <w:t>📩 СООБЩЕНИЕ В DIRECT (ПО СЛОВУ «СИЛА»):</w:t>
         <w:br/>
         <w:t>«Здравствуйте! На связи Анатолий Фёдоров.</w:t>
         <w:br/>
@@ -527,12 +512,7 @@
         <w:br/>
         <w:t>👉 О мужской и женской психологии простыми словами — в канале «Простые вещи»:</w:t>
         <w:br/>
-        <w:t>https://t.me/smplthing</w:t>
-        <w:br/>
-        <w:br/>
-        <w:t>🧭 Пройдите тест на гармонию в вашей паре:</w:t>
-        <w:br/>
-        <w:t>[Кнопка: 🧭 Пройти экспресс-тест (2 мин)]»</w:t>
+        <w:t>https://t.me/smplthing»</w:t>
       </w:r>
     </w:p>
     <w:p>
@@ -619,7 +599,7 @@
           <w:i w:val="0"/>
           <w:sz w:val="20"/>
         </w:rPr>
-        <w:t>📩 СООБЩЕНИЕ В DIRECT (ЧТО ПРИХОДИТ ПОЛЬЗОВАТЕЛЮ ПО СЛОВУ «ГРАНИЦЫ»):</w:t>
+        <w:t>📩 СООБЩЕНИЕ В DIRECT (ПО СЛОВУ «ГРАНИЦЫ»):</w:t>
         <w:br/>
         <w:t>«Здравствуйте! С вами Анатолий Фёдоров.</w:t>
         <w:br/>
@@ -664,12 +644,7 @@
         <w:br/>
         <w:t>👉 Как выстраивать границы без чувства вины — разбираем в канале «Простые вещи»:</w:t>
         <w:br/>
-        <w:t>https://t.me/smplthing</w:t>
-        <w:br/>
-        <w:br/>
-        <w:t>🧭 Пройдите тест: «Умеете ли вы защищать личные границы»:</w:t>
-        <w:br/>
-        <w:t>[Кнопка: 🧭 Пройти тест за 2 минуты]»</w:t>
+        <w:t>https://t.me/smplthing»</w:t>
       </w:r>
     </w:p>
     <w:p>
@@ -757,7 +732,7 @@
           <w:i w:val="0"/>
           <w:sz w:val="20"/>
         </w:rPr>
-        <w:t>📩 СООБЩЕНИЕ В DIRECT (ЧТО ПРИХОДИТ ПОЛЬЗОВАТЕЛЮ ПО СЛОВУ «ДЕНЬГИ»):</w:t>
+        <w:t>📩 СООБЩЕНИЕ В DIRECT (ПО СЛОВУ «ДЕНЬГИ»):</w:t>
         <w:br/>
         <w:t>«Здравствуйте! На связи Анатолий Фёдоров.</w:t>
         <w:br/>
@@ -786,10 +761,7 @@
         <w:br/>
         <w:t>👉 А пока заходите в мой Telegram-канал «Простые вещи», где я делюсь базой психологии отношений и денег:</w:t>
         <w:br/>
-        <w:t>https://t.me/smplthing</w:t>
-        <w:br/>
-        <w:br/>
-        <w:t>[Кнопка: 🎟 Зарегистрироваться на вебинар и занять место]»</w:t>
+        <w:t>https://t.me/smplthing»</w:t>
       </w:r>
     </w:p>
     <w:p>

</xml_diff>